<commit_message>
add more practice task and files
</commit_message>
<xml_diff>
--- a/Documentation/Section20_ApiRouter.docx
+++ b/Documentation/Section20_ApiRouter.docx
@@ -779,7 +779,7 @@
     <w:p>
       <w:r>
         <w:pict>
-          <v:rect id="_x0000_i1027" style="width:0;height:1.5pt" o:hralign="center" o:hrstd="t" o:hr="t" fillcolor="#a0a0a0" stroked="f"/>
+          <v:rect id="_x0000_i1025" style="width:0;height:1.5pt" o:hralign="center" o:hrstd="t" o:hr="t" fillcolor="#a0a0a0" stroked="f"/>
         </w:pict>
       </w:r>
     </w:p>
@@ -1755,7 +1755,7 @@
       </w:pPr>
       <w:r>
         <w:pict>
-          <v:rect id="_x0000_i1028" style="width:0;height:1.5pt" o:hralign="center" o:hrstd="t" o:hr="t" fillcolor="#a0a0a0" stroked="f"/>
+          <v:rect id="_x0000_i1026" style="width:0;height:1.5pt" o:hralign="center" o:hrstd="t" o:hr="t" fillcolor="#a0a0a0" stroked="f"/>
         </w:pict>
       </w:r>
     </w:p>
@@ -2210,6 +2210,1217 @@
       </w:pPr>
       <w:r>
         <w:pict>
+          <v:rect id="_x0000_i1027" style="width:0;height:1.5pt" o:hralign="center" o:hrstd="t" o:hr="t" fillcolor="#a0a0a0" stroked="f"/>
+        </w:pict>
+      </w:r>
+    </w:p>
+    <w:p>
+      <w:pPr>
+        <w:pStyle w:val="Heading1"/>
+      </w:pPr>
+      <w:r>
+        <w:rPr>
+          <w:rFonts w:ascii="Segoe UI Symbol" w:hAnsi="Segoe UI Symbol" w:cs="Segoe UI Symbol"/>
+        </w:rPr>
+        <w:t>🔹</w:t>
+      </w:r>
+      <w:r>
+        <w:t xml:space="preserve"> Example 2: Product Router</w:t>
+      </w:r>
+    </w:p>
+    <w:p>
+      <w:pPr>
+        <w:pStyle w:val="Heading2"/>
+      </w:pPr>
+      <w:r>
+        <w:rPr>
+          <w:rFonts w:ascii="Segoe UI Symbol" w:hAnsi="Segoe UI Symbol" w:cs="Segoe UI Symbol"/>
+        </w:rPr>
+        <w:t>📁</w:t>
+      </w:r>
+      <w:r>
+        <w:t xml:space="preserve"> </w:t>
+      </w:r>
+      <w:r>
+        <w:rPr>
+          <w:rStyle w:val="HTMLCode"/>
+        </w:rPr>
+        <w:t>product/routers.py</w:t>
+      </w:r>
+    </w:p>
+    <w:p>
+      <w:pPr>
+        <w:shd w:val="clear" w:color="auto" w:fill="1E1E1E"/>
+        <w:spacing w:after="0" w:line="285" w:lineRule="atLeast"/>
+        <w:rPr>
+          <w:rFonts w:ascii="Consolas" w:eastAsia="Times New Roman" w:hAnsi="Consolas" w:cs="Times New Roman"/>
+          <w:color w:val="D4D4D4"/>
+          <w:sz w:val="21"/>
+          <w:szCs w:val="21"/>
+        </w:rPr>
+      </w:pPr>
+      <w:r>
+        <w:rPr>
+          <w:rFonts w:ascii="Consolas" w:eastAsia="Times New Roman" w:hAnsi="Consolas" w:cs="Times New Roman"/>
+          <w:color w:val="C586C0"/>
+          <w:sz w:val="21"/>
+          <w:szCs w:val="21"/>
+        </w:rPr>
+        <w:t>from</w:t>
+      </w:r>
+      <w:r>
+        <w:rPr>
+          <w:rFonts w:ascii="Consolas" w:eastAsia="Times New Roman" w:hAnsi="Consolas" w:cs="Times New Roman"/>
+          <w:color w:val="D4D4D4"/>
+          <w:sz w:val="21"/>
+          <w:szCs w:val="21"/>
+        </w:rPr>
+        <w:t xml:space="preserve"> </w:t>
+      </w:r>
+      <w:r>
+        <w:rPr>
+          <w:rFonts w:ascii="Consolas" w:eastAsia="Times New Roman" w:hAnsi="Consolas" w:cs="Times New Roman"/>
+          <w:color w:val="4EC9B0"/>
+          <w:sz w:val="21"/>
+          <w:szCs w:val="21"/>
+        </w:rPr>
+        <w:t>fastapi</w:t>
+      </w:r>
+      <w:r>
+        <w:rPr>
+          <w:rFonts w:ascii="Consolas" w:eastAsia="Times New Roman" w:hAnsi="Consolas" w:cs="Times New Roman"/>
+          <w:color w:val="D4D4D4"/>
+          <w:sz w:val="21"/>
+          <w:szCs w:val="21"/>
+        </w:rPr>
+        <w:t xml:space="preserve"> </w:t>
+      </w:r>
+      <w:r>
+        <w:rPr>
+          <w:rFonts w:ascii="Consolas" w:eastAsia="Times New Roman" w:hAnsi="Consolas" w:cs="Times New Roman"/>
+          <w:color w:val="C586C0"/>
+          <w:sz w:val="21"/>
+          <w:szCs w:val="21"/>
+        </w:rPr>
+        <w:t>import</w:t>
+      </w:r>
+      <w:r>
+        <w:rPr>
+          <w:rFonts w:ascii="Consolas" w:eastAsia="Times New Roman" w:hAnsi="Consolas" w:cs="Times New Roman"/>
+          <w:color w:val="D4D4D4"/>
+          <w:sz w:val="21"/>
+          <w:szCs w:val="21"/>
+        </w:rPr>
+        <w:t xml:space="preserve"> </w:t>
+      </w:r>
+      <w:r>
+        <w:rPr>
+          <w:rFonts w:ascii="Consolas" w:eastAsia="Times New Roman" w:hAnsi="Consolas" w:cs="Times New Roman"/>
+          <w:color w:val="4EC9B0"/>
+          <w:sz w:val="21"/>
+          <w:szCs w:val="21"/>
+        </w:rPr>
+        <w:t>APIRouter</w:t>
+      </w:r>
+    </w:p>
+    <w:p>
+      <w:pPr>
+        <w:shd w:val="clear" w:color="auto" w:fill="1E1E1E"/>
+        <w:spacing w:after="0" w:line="285" w:lineRule="atLeast"/>
+        <w:rPr>
+          <w:rFonts w:ascii="Consolas" w:eastAsia="Times New Roman" w:hAnsi="Consolas" w:cs="Times New Roman"/>
+          <w:color w:val="D4D4D4"/>
+          <w:sz w:val="21"/>
+          <w:szCs w:val="21"/>
+        </w:rPr>
+      </w:pPr>
+    </w:p>
+    <w:p>
+      <w:pPr>
+        <w:shd w:val="clear" w:color="auto" w:fill="1E1E1E"/>
+        <w:spacing w:after="0" w:line="285" w:lineRule="atLeast"/>
+        <w:rPr>
+          <w:rFonts w:ascii="Consolas" w:eastAsia="Times New Roman" w:hAnsi="Consolas" w:cs="Times New Roman"/>
+          <w:color w:val="D4D4D4"/>
+          <w:sz w:val="21"/>
+          <w:szCs w:val="21"/>
+        </w:rPr>
+      </w:pPr>
+      <w:r>
+        <w:rPr>
+          <w:rFonts w:ascii="Consolas" w:eastAsia="Times New Roman" w:hAnsi="Consolas" w:cs="Times New Roman"/>
+          <w:color w:val="9CDCFE"/>
+          <w:sz w:val="21"/>
+          <w:szCs w:val="21"/>
+        </w:rPr>
+        <w:t>router</w:t>
+      </w:r>
+      <w:r>
+        <w:rPr>
+          <w:rFonts w:ascii="Consolas" w:eastAsia="Times New Roman" w:hAnsi="Consolas" w:cs="Times New Roman"/>
+          <w:color w:val="D4D4D4"/>
+          <w:sz w:val="21"/>
+          <w:szCs w:val="21"/>
+        </w:rPr>
+        <w:t xml:space="preserve"> = </w:t>
+      </w:r>
+      <w:r>
+        <w:rPr>
+          <w:rFonts w:ascii="Consolas" w:eastAsia="Times New Roman" w:hAnsi="Consolas" w:cs="Times New Roman"/>
+          <w:color w:val="4EC9B0"/>
+          <w:sz w:val="21"/>
+          <w:szCs w:val="21"/>
+        </w:rPr>
+        <w:t>APIRouter</w:t>
+      </w:r>
+      <w:r>
+        <w:rPr>
+          <w:rFonts w:ascii="Consolas" w:eastAsia="Times New Roman" w:hAnsi="Consolas" w:cs="Times New Roman"/>
+          <w:color w:val="D4D4D4"/>
+          <w:sz w:val="21"/>
+          <w:szCs w:val="21"/>
+        </w:rPr>
+        <w:t>()</w:t>
+      </w:r>
+    </w:p>
+    <w:p>
+      <w:pPr>
+        <w:shd w:val="clear" w:color="auto" w:fill="1E1E1E"/>
+        <w:spacing w:after="0" w:line="285" w:lineRule="atLeast"/>
+        <w:rPr>
+          <w:rFonts w:ascii="Consolas" w:eastAsia="Times New Roman" w:hAnsi="Consolas" w:cs="Times New Roman"/>
+          <w:color w:val="D4D4D4"/>
+          <w:sz w:val="21"/>
+          <w:szCs w:val="21"/>
+        </w:rPr>
+      </w:pPr>
+    </w:p>
+    <w:p>
+      <w:pPr>
+        <w:shd w:val="clear" w:color="auto" w:fill="1E1E1E"/>
+        <w:spacing w:after="0" w:line="285" w:lineRule="atLeast"/>
+        <w:rPr>
+          <w:rFonts w:ascii="Consolas" w:eastAsia="Times New Roman" w:hAnsi="Consolas" w:cs="Times New Roman"/>
+          <w:color w:val="D4D4D4"/>
+          <w:sz w:val="21"/>
+          <w:szCs w:val="21"/>
+        </w:rPr>
+      </w:pPr>
+      <w:r>
+        <w:rPr>
+          <w:rFonts w:ascii="Consolas" w:eastAsia="Times New Roman" w:hAnsi="Consolas" w:cs="Times New Roman"/>
+          <w:color w:val="DCDCAA"/>
+          <w:sz w:val="21"/>
+          <w:szCs w:val="21"/>
+        </w:rPr>
+        <w:t>@</w:t>
+      </w:r>
+      <w:r>
+        <w:rPr>
+          <w:rFonts w:ascii="Consolas" w:eastAsia="Times New Roman" w:hAnsi="Consolas" w:cs="Times New Roman"/>
+          <w:color w:val="9CDCFE"/>
+          <w:sz w:val="21"/>
+          <w:szCs w:val="21"/>
+        </w:rPr>
+        <w:t>router</w:t>
+      </w:r>
+      <w:r>
+        <w:rPr>
+          <w:rFonts w:ascii="Consolas" w:eastAsia="Times New Roman" w:hAnsi="Consolas" w:cs="Times New Roman"/>
+          <w:color w:val="DCDCAA"/>
+          <w:sz w:val="21"/>
+          <w:szCs w:val="21"/>
+        </w:rPr>
+        <w:t>.get</w:t>
+      </w:r>
+      <w:r>
+        <w:rPr>
+          <w:rFonts w:ascii="Consolas" w:eastAsia="Times New Roman" w:hAnsi="Consolas" w:cs="Times New Roman"/>
+          <w:color w:val="D4D4D4"/>
+          <w:sz w:val="21"/>
+          <w:szCs w:val="21"/>
+        </w:rPr>
+        <w:t>(</w:t>
+      </w:r>
+      <w:r>
+        <w:rPr>
+          <w:rFonts w:ascii="Consolas" w:eastAsia="Times New Roman" w:hAnsi="Consolas" w:cs="Times New Roman"/>
+          <w:color w:val="CE9178"/>
+          <w:sz w:val="21"/>
+          <w:szCs w:val="21"/>
+        </w:rPr>
+        <w:t>"/products"</w:t>
+      </w:r>
+      <w:r>
+        <w:rPr>
+          <w:rFonts w:ascii="Consolas" w:eastAsia="Times New Roman" w:hAnsi="Consolas" w:cs="Times New Roman"/>
+          <w:color w:val="D4D4D4"/>
+          <w:sz w:val="21"/>
+          <w:szCs w:val="21"/>
+        </w:rPr>
+        <w:t>)</w:t>
+      </w:r>
+    </w:p>
+    <w:p>
+      <w:pPr>
+        <w:shd w:val="clear" w:color="auto" w:fill="1E1E1E"/>
+        <w:spacing w:after="0" w:line="285" w:lineRule="atLeast"/>
+        <w:rPr>
+          <w:rFonts w:ascii="Consolas" w:eastAsia="Times New Roman" w:hAnsi="Consolas" w:cs="Times New Roman"/>
+          <w:color w:val="D4D4D4"/>
+          <w:sz w:val="21"/>
+          <w:szCs w:val="21"/>
+        </w:rPr>
+      </w:pPr>
+      <w:r>
+        <w:rPr>
+          <w:rFonts w:ascii="Consolas" w:eastAsia="Times New Roman" w:hAnsi="Consolas" w:cs="Times New Roman"/>
+          <w:color w:val="569CD6"/>
+          <w:sz w:val="21"/>
+          <w:szCs w:val="21"/>
+        </w:rPr>
+        <w:t>async</w:t>
+      </w:r>
+      <w:r>
+        <w:rPr>
+          <w:rFonts w:ascii="Consolas" w:eastAsia="Times New Roman" w:hAnsi="Consolas" w:cs="Times New Roman"/>
+          <w:color w:val="D4D4D4"/>
+          <w:sz w:val="21"/>
+          <w:szCs w:val="21"/>
+        </w:rPr>
+        <w:t xml:space="preserve"> </w:t>
+      </w:r>
+      <w:r>
+        <w:rPr>
+          <w:rFonts w:ascii="Consolas" w:eastAsia="Times New Roman" w:hAnsi="Consolas" w:cs="Times New Roman"/>
+          <w:color w:val="569CD6"/>
+          <w:sz w:val="21"/>
+          <w:szCs w:val="21"/>
+        </w:rPr>
+        <w:t>def</w:t>
+      </w:r>
+      <w:r>
+        <w:rPr>
+          <w:rFonts w:ascii="Consolas" w:eastAsia="Times New Roman" w:hAnsi="Consolas" w:cs="Times New Roman"/>
+          <w:color w:val="D4D4D4"/>
+          <w:sz w:val="21"/>
+          <w:szCs w:val="21"/>
+        </w:rPr>
+        <w:t xml:space="preserve"> </w:t>
+      </w:r>
+      <w:r>
+        <w:rPr>
+          <w:rFonts w:ascii="Consolas" w:eastAsia="Times New Roman" w:hAnsi="Consolas" w:cs="Times New Roman"/>
+          <w:color w:val="DCDCAA"/>
+          <w:sz w:val="21"/>
+          <w:szCs w:val="21"/>
+        </w:rPr>
+        <w:t>get_all_products</w:t>
+      </w:r>
+      <w:r>
+        <w:rPr>
+          <w:rFonts w:ascii="Consolas" w:eastAsia="Times New Roman" w:hAnsi="Consolas" w:cs="Times New Roman"/>
+          <w:color w:val="D4D4D4"/>
+          <w:sz w:val="21"/>
+          <w:szCs w:val="21"/>
+        </w:rPr>
+        <w:t>():</w:t>
+      </w:r>
+    </w:p>
+    <w:p>
+      <w:pPr>
+        <w:shd w:val="clear" w:color="auto" w:fill="1E1E1E"/>
+        <w:spacing w:after="0" w:line="285" w:lineRule="atLeast"/>
+        <w:rPr>
+          <w:rFonts w:ascii="Consolas" w:eastAsia="Times New Roman" w:hAnsi="Consolas" w:cs="Times New Roman"/>
+          <w:color w:val="D4D4D4"/>
+          <w:sz w:val="21"/>
+          <w:szCs w:val="21"/>
+        </w:rPr>
+      </w:pPr>
+      <w:r>
+        <w:rPr>
+          <w:rFonts w:ascii="Consolas" w:eastAsia="Times New Roman" w:hAnsi="Consolas" w:cs="Times New Roman"/>
+          <w:color w:val="D4D4D4"/>
+          <w:sz w:val="21"/>
+          <w:szCs w:val="21"/>
+        </w:rPr>
+        <w:t xml:space="preserve">    </w:t>
+      </w:r>
+      <w:r>
+        <w:rPr>
+          <w:rFonts w:ascii="Consolas" w:eastAsia="Times New Roman" w:hAnsi="Consolas" w:cs="Times New Roman"/>
+          <w:color w:val="C586C0"/>
+          <w:sz w:val="21"/>
+          <w:szCs w:val="21"/>
+        </w:rPr>
+        <w:t>return</w:t>
+      </w:r>
+      <w:r>
+        <w:rPr>
+          <w:rFonts w:ascii="Consolas" w:eastAsia="Times New Roman" w:hAnsi="Consolas" w:cs="Times New Roman"/>
+          <w:color w:val="D4D4D4"/>
+          <w:sz w:val="21"/>
+          <w:szCs w:val="21"/>
+        </w:rPr>
+        <w:t xml:space="preserve"> {</w:t>
+      </w:r>
+      <w:r>
+        <w:rPr>
+          <w:rFonts w:ascii="Consolas" w:eastAsia="Times New Roman" w:hAnsi="Consolas" w:cs="Times New Roman"/>
+          <w:color w:val="CE9178"/>
+          <w:sz w:val="21"/>
+          <w:szCs w:val="21"/>
+        </w:rPr>
+        <w:t>"data"</w:t>
+      </w:r>
+      <w:r>
+        <w:rPr>
+          <w:rFonts w:ascii="Consolas" w:eastAsia="Times New Roman" w:hAnsi="Consolas" w:cs="Times New Roman"/>
+          <w:color w:val="D4D4D4"/>
+          <w:sz w:val="21"/>
+          <w:szCs w:val="21"/>
+        </w:rPr>
+        <w:t xml:space="preserve">: </w:t>
+      </w:r>
+      <w:r>
+        <w:rPr>
+          <w:rFonts w:ascii="Consolas" w:eastAsia="Times New Roman" w:hAnsi="Consolas" w:cs="Times New Roman"/>
+          <w:color w:val="CE9178"/>
+          <w:sz w:val="21"/>
+          <w:szCs w:val="21"/>
+        </w:rPr>
+        <w:t>"ALL products"</w:t>
+      </w:r>
+      <w:r>
+        <w:rPr>
+          <w:rFonts w:ascii="Consolas" w:eastAsia="Times New Roman" w:hAnsi="Consolas" w:cs="Times New Roman"/>
+          <w:color w:val="D4D4D4"/>
+          <w:sz w:val="21"/>
+          <w:szCs w:val="21"/>
+        </w:rPr>
+        <w:t>}</w:t>
+      </w:r>
+    </w:p>
+    <w:p>
+      <w:pPr>
+        <w:shd w:val="clear" w:color="auto" w:fill="1E1E1E"/>
+        <w:spacing w:after="0" w:line="285" w:lineRule="atLeast"/>
+        <w:rPr>
+          <w:rFonts w:ascii="Consolas" w:eastAsia="Times New Roman" w:hAnsi="Consolas" w:cs="Times New Roman"/>
+          <w:color w:val="D4D4D4"/>
+          <w:sz w:val="21"/>
+          <w:szCs w:val="21"/>
+        </w:rPr>
+      </w:pPr>
+    </w:p>
+    <w:p>
+      <w:pPr>
+        <w:shd w:val="clear" w:color="auto" w:fill="1E1E1E"/>
+        <w:spacing w:after="0" w:line="285" w:lineRule="atLeast"/>
+        <w:rPr>
+          <w:rFonts w:ascii="Consolas" w:eastAsia="Times New Roman" w:hAnsi="Consolas" w:cs="Times New Roman"/>
+          <w:color w:val="D4D4D4"/>
+          <w:sz w:val="21"/>
+          <w:szCs w:val="21"/>
+        </w:rPr>
+      </w:pPr>
+      <w:r>
+        <w:rPr>
+          <w:rFonts w:ascii="Consolas" w:eastAsia="Times New Roman" w:hAnsi="Consolas" w:cs="Times New Roman"/>
+          <w:color w:val="DCDCAA"/>
+          <w:sz w:val="21"/>
+          <w:szCs w:val="21"/>
+        </w:rPr>
+        <w:t>@</w:t>
+      </w:r>
+      <w:r>
+        <w:rPr>
+          <w:rFonts w:ascii="Consolas" w:eastAsia="Times New Roman" w:hAnsi="Consolas" w:cs="Times New Roman"/>
+          <w:color w:val="9CDCFE"/>
+          <w:sz w:val="21"/>
+          <w:szCs w:val="21"/>
+        </w:rPr>
+        <w:t>router</w:t>
+      </w:r>
+      <w:r>
+        <w:rPr>
+          <w:rFonts w:ascii="Consolas" w:eastAsia="Times New Roman" w:hAnsi="Consolas" w:cs="Times New Roman"/>
+          <w:color w:val="DCDCAA"/>
+          <w:sz w:val="21"/>
+          <w:szCs w:val="21"/>
+        </w:rPr>
+        <w:t>.get</w:t>
+      </w:r>
+      <w:r>
+        <w:rPr>
+          <w:rFonts w:ascii="Consolas" w:eastAsia="Times New Roman" w:hAnsi="Consolas" w:cs="Times New Roman"/>
+          <w:color w:val="D4D4D4"/>
+          <w:sz w:val="21"/>
+          <w:szCs w:val="21"/>
+        </w:rPr>
+        <w:t>(</w:t>
+      </w:r>
+      <w:r>
+        <w:rPr>
+          <w:rFonts w:ascii="Consolas" w:eastAsia="Times New Roman" w:hAnsi="Consolas" w:cs="Times New Roman"/>
+          <w:color w:val="CE9178"/>
+          <w:sz w:val="21"/>
+          <w:szCs w:val="21"/>
+        </w:rPr>
+        <w:t>"/products/</w:t>
+      </w:r>
+      <w:r>
+        <w:rPr>
+          <w:rFonts w:ascii="Consolas" w:eastAsia="Times New Roman" w:hAnsi="Consolas" w:cs="Times New Roman"/>
+          <w:color w:val="569CD6"/>
+          <w:sz w:val="21"/>
+          <w:szCs w:val="21"/>
+        </w:rPr>
+        <w:t>{product_id}</w:t>
+      </w:r>
+      <w:r>
+        <w:rPr>
+          <w:rFonts w:ascii="Consolas" w:eastAsia="Times New Roman" w:hAnsi="Consolas" w:cs="Times New Roman"/>
+          <w:color w:val="CE9178"/>
+          <w:sz w:val="21"/>
+          <w:szCs w:val="21"/>
+        </w:rPr>
+        <w:t>"</w:t>
+      </w:r>
+      <w:r>
+        <w:rPr>
+          <w:rFonts w:ascii="Consolas" w:eastAsia="Times New Roman" w:hAnsi="Consolas" w:cs="Times New Roman"/>
+          <w:color w:val="D4D4D4"/>
+          <w:sz w:val="21"/>
+          <w:szCs w:val="21"/>
+        </w:rPr>
+        <w:t>)</w:t>
+      </w:r>
+    </w:p>
+    <w:p>
+      <w:pPr>
+        <w:shd w:val="clear" w:color="auto" w:fill="1E1E1E"/>
+        <w:spacing w:after="0" w:line="285" w:lineRule="atLeast"/>
+        <w:rPr>
+          <w:rFonts w:ascii="Consolas" w:eastAsia="Times New Roman" w:hAnsi="Consolas" w:cs="Times New Roman"/>
+          <w:color w:val="D4D4D4"/>
+          <w:sz w:val="21"/>
+          <w:szCs w:val="21"/>
+        </w:rPr>
+      </w:pPr>
+      <w:r>
+        <w:rPr>
+          <w:rFonts w:ascii="Consolas" w:eastAsia="Times New Roman" w:hAnsi="Consolas" w:cs="Times New Roman"/>
+          <w:color w:val="569CD6"/>
+          <w:sz w:val="21"/>
+          <w:szCs w:val="21"/>
+        </w:rPr>
+        <w:t>async</w:t>
+      </w:r>
+      <w:r>
+        <w:rPr>
+          <w:rFonts w:ascii="Consolas" w:eastAsia="Times New Roman" w:hAnsi="Consolas" w:cs="Times New Roman"/>
+          <w:color w:val="D4D4D4"/>
+          <w:sz w:val="21"/>
+          <w:szCs w:val="21"/>
+        </w:rPr>
+        <w:t xml:space="preserve"> </w:t>
+      </w:r>
+      <w:r>
+        <w:rPr>
+          <w:rFonts w:ascii="Consolas" w:eastAsia="Times New Roman" w:hAnsi="Consolas" w:cs="Times New Roman"/>
+          <w:color w:val="569CD6"/>
+          <w:sz w:val="21"/>
+          <w:szCs w:val="21"/>
+        </w:rPr>
+        <w:t>def</w:t>
+      </w:r>
+      <w:r>
+        <w:rPr>
+          <w:rFonts w:ascii="Consolas" w:eastAsia="Times New Roman" w:hAnsi="Consolas" w:cs="Times New Roman"/>
+          <w:color w:val="D4D4D4"/>
+          <w:sz w:val="21"/>
+          <w:szCs w:val="21"/>
+        </w:rPr>
+        <w:t xml:space="preserve"> </w:t>
+      </w:r>
+      <w:r>
+        <w:rPr>
+          <w:rFonts w:ascii="Consolas" w:eastAsia="Times New Roman" w:hAnsi="Consolas" w:cs="Times New Roman"/>
+          <w:color w:val="DCDCAA"/>
+          <w:sz w:val="21"/>
+          <w:szCs w:val="21"/>
+        </w:rPr>
+        <w:t>get_single_product</w:t>
+      </w:r>
+      <w:r>
+        <w:rPr>
+          <w:rFonts w:ascii="Consolas" w:eastAsia="Times New Roman" w:hAnsi="Consolas" w:cs="Times New Roman"/>
+          <w:color w:val="D4D4D4"/>
+          <w:sz w:val="21"/>
+          <w:szCs w:val="21"/>
+        </w:rPr>
+        <w:t>(</w:t>
+      </w:r>
+      <w:r>
+        <w:rPr>
+          <w:rFonts w:ascii="Consolas" w:eastAsia="Times New Roman" w:hAnsi="Consolas" w:cs="Times New Roman"/>
+          <w:color w:val="9CDCFE"/>
+          <w:sz w:val="21"/>
+          <w:szCs w:val="21"/>
+        </w:rPr>
+        <w:t>product_id</w:t>
+      </w:r>
+      <w:r>
+        <w:rPr>
+          <w:rFonts w:ascii="Consolas" w:eastAsia="Times New Roman" w:hAnsi="Consolas" w:cs="Times New Roman"/>
+          <w:color w:val="D4D4D4"/>
+          <w:sz w:val="21"/>
+          <w:szCs w:val="21"/>
+        </w:rPr>
+        <w:t xml:space="preserve">: </w:t>
+      </w:r>
+      <w:r>
+        <w:rPr>
+          <w:rFonts w:ascii="Consolas" w:eastAsia="Times New Roman" w:hAnsi="Consolas" w:cs="Times New Roman"/>
+          <w:color w:val="4EC9B0"/>
+          <w:sz w:val="21"/>
+          <w:szCs w:val="21"/>
+        </w:rPr>
+        <w:t>int</w:t>
+      </w:r>
+      <w:r>
+        <w:rPr>
+          <w:rFonts w:ascii="Consolas" w:eastAsia="Times New Roman" w:hAnsi="Consolas" w:cs="Times New Roman"/>
+          <w:color w:val="D4D4D4"/>
+          <w:sz w:val="21"/>
+          <w:szCs w:val="21"/>
+        </w:rPr>
+        <w:t>):</w:t>
+      </w:r>
+    </w:p>
+    <w:p>
+      <w:pPr>
+        <w:shd w:val="clear" w:color="auto" w:fill="1E1E1E"/>
+        <w:spacing w:after="0" w:line="285" w:lineRule="atLeast"/>
+        <w:rPr>
+          <w:rFonts w:ascii="Consolas" w:eastAsia="Times New Roman" w:hAnsi="Consolas" w:cs="Times New Roman"/>
+          <w:color w:val="D4D4D4"/>
+          <w:sz w:val="21"/>
+          <w:szCs w:val="21"/>
+        </w:rPr>
+      </w:pPr>
+      <w:r>
+        <w:rPr>
+          <w:rFonts w:ascii="Consolas" w:eastAsia="Times New Roman" w:hAnsi="Consolas" w:cs="Times New Roman"/>
+          <w:color w:val="D4D4D4"/>
+          <w:sz w:val="21"/>
+          <w:szCs w:val="21"/>
+        </w:rPr>
+        <w:t xml:space="preserve">    </w:t>
+      </w:r>
+      <w:r>
+        <w:rPr>
+          <w:rFonts w:ascii="Consolas" w:eastAsia="Times New Roman" w:hAnsi="Consolas" w:cs="Times New Roman"/>
+          <w:color w:val="C586C0"/>
+          <w:sz w:val="21"/>
+          <w:szCs w:val="21"/>
+        </w:rPr>
+        <w:t>return</w:t>
+      </w:r>
+      <w:r>
+        <w:rPr>
+          <w:rFonts w:ascii="Consolas" w:eastAsia="Times New Roman" w:hAnsi="Consolas" w:cs="Times New Roman"/>
+          <w:color w:val="D4D4D4"/>
+          <w:sz w:val="21"/>
+          <w:szCs w:val="21"/>
+        </w:rPr>
+        <w:t xml:space="preserve"> {</w:t>
+      </w:r>
+      <w:r>
+        <w:rPr>
+          <w:rFonts w:ascii="Consolas" w:eastAsia="Times New Roman" w:hAnsi="Consolas" w:cs="Times New Roman"/>
+          <w:color w:val="CE9178"/>
+          <w:sz w:val="21"/>
+          <w:szCs w:val="21"/>
+        </w:rPr>
+        <w:t>"data"</w:t>
+      </w:r>
+      <w:r>
+        <w:rPr>
+          <w:rFonts w:ascii="Consolas" w:eastAsia="Times New Roman" w:hAnsi="Consolas" w:cs="Times New Roman"/>
+          <w:color w:val="D4D4D4"/>
+          <w:sz w:val="21"/>
+          <w:szCs w:val="21"/>
+        </w:rPr>
+        <w:t xml:space="preserve">: </w:t>
+      </w:r>
+      <w:r>
+        <w:rPr>
+          <w:rFonts w:ascii="Consolas" w:eastAsia="Times New Roman" w:hAnsi="Consolas" w:cs="Times New Roman"/>
+          <w:color w:val="CE9178"/>
+          <w:sz w:val="21"/>
+          <w:szCs w:val="21"/>
+        </w:rPr>
+        <w:t>"Single product"</w:t>
+      </w:r>
+      <w:r>
+        <w:rPr>
+          <w:rFonts w:ascii="Consolas" w:eastAsia="Times New Roman" w:hAnsi="Consolas" w:cs="Times New Roman"/>
+          <w:color w:val="D4D4D4"/>
+          <w:sz w:val="21"/>
+          <w:szCs w:val="21"/>
+        </w:rPr>
+        <w:t>}</w:t>
+      </w:r>
+    </w:p>
+    <w:p>
+      <w:pPr>
+        <w:shd w:val="clear" w:color="auto" w:fill="1E1E1E"/>
+        <w:spacing w:after="0" w:line="285" w:lineRule="atLeast"/>
+        <w:rPr>
+          <w:rFonts w:ascii="Consolas" w:eastAsia="Times New Roman" w:hAnsi="Consolas" w:cs="Times New Roman"/>
+          <w:color w:val="D4D4D4"/>
+          <w:sz w:val="21"/>
+          <w:szCs w:val="21"/>
+        </w:rPr>
+      </w:pPr>
+    </w:p>
+    <w:p>
+      <w:r>
+        <w:pict>
+          <v:rect id="_x0000_i1028" style="width:0;height:1.5pt" o:hralign="center" o:hrstd="t" o:hr="t" fillcolor="#a0a0a0" stroked="f"/>
+        </w:pict>
+      </w:r>
+    </w:p>
+    <w:p>
+      <w:pPr>
+        <w:pStyle w:val="Heading2"/>
+      </w:pPr>
+      <w:r>
+        <w:rPr>
+          <w:rFonts w:ascii="Segoe UI Symbol" w:hAnsi="Segoe UI Symbol" w:cs="Segoe UI Symbol"/>
+        </w:rPr>
+        <w:t>📁</w:t>
+      </w:r>
+      <w:r>
+        <w:t xml:space="preserve"> Updated </w:t>
+      </w:r>
+      <w:r>
+        <w:rPr>
+          <w:rStyle w:val="HTMLCode"/>
+        </w:rPr>
+        <w:t>main.py</w:t>
+      </w:r>
+    </w:p>
+    <w:p>
+      <w:pPr>
+        <w:shd w:val="clear" w:color="auto" w:fill="1E1E1E"/>
+        <w:spacing w:after="0" w:line="285" w:lineRule="atLeast"/>
+        <w:rPr>
+          <w:rFonts w:ascii="Consolas" w:eastAsia="Times New Roman" w:hAnsi="Consolas" w:cs="Times New Roman"/>
+          <w:color w:val="D4D4D4"/>
+          <w:sz w:val="21"/>
+          <w:szCs w:val="21"/>
+        </w:rPr>
+      </w:pPr>
+      <w:r>
+        <w:rPr>
+          <w:rFonts w:ascii="Consolas" w:eastAsia="Times New Roman" w:hAnsi="Consolas" w:cs="Times New Roman"/>
+          <w:color w:val="C586C0"/>
+          <w:sz w:val="21"/>
+          <w:szCs w:val="21"/>
+        </w:rPr>
+        <w:t>from</w:t>
+      </w:r>
+      <w:r>
+        <w:rPr>
+          <w:rFonts w:ascii="Consolas" w:eastAsia="Times New Roman" w:hAnsi="Consolas" w:cs="Times New Roman"/>
+          <w:color w:val="D4D4D4"/>
+          <w:sz w:val="21"/>
+          <w:szCs w:val="21"/>
+        </w:rPr>
+        <w:t xml:space="preserve"> </w:t>
+      </w:r>
+      <w:r>
+        <w:rPr>
+          <w:rFonts w:ascii="Consolas" w:eastAsia="Times New Roman" w:hAnsi="Consolas" w:cs="Times New Roman"/>
+          <w:color w:val="4EC9B0"/>
+          <w:sz w:val="21"/>
+          <w:szCs w:val="21"/>
+        </w:rPr>
+        <w:t>fastapi</w:t>
+      </w:r>
+      <w:r>
+        <w:rPr>
+          <w:rFonts w:ascii="Consolas" w:eastAsia="Times New Roman" w:hAnsi="Consolas" w:cs="Times New Roman"/>
+          <w:color w:val="D4D4D4"/>
+          <w:sz w:val="21"/>
+          <w:szCs w:val="21"/>
+        </w:rPr>
+        <w:t xml:space="preserve"> </w:t>
+      </w:r>
+      <w:r>
+        <w:rPr>
+          <w:rFonts w:ascii="Consolas" w:eastAsia="Times New Roman" w:hAnsi="Consolas" w:cs="Times New Roman"/>
+          <w:color w:val="C586C0"/>
+          <w:sz w:val="21"/>
+          <w:szCs w:val="21"/>
+        </w:rPr>
+        <w:t>import</w:t>
+      </w:r>
+      <w:r>
+        <w:rPr>
+          <w:rFonts w:ascii="Consolas" w:eastAsia="Times New Roman" w:hAnsi="Consolas" w:cs="Times New Roman"/>
+          <w:color w:val="D4D4D4"/>
+          <w:sz w:val="21"/>
+          <w:szCs w:val="21"/>
+        </w:rPr>
+        <w:t xml:space="preserve"> </w:t>
+      </w:r>
+      <w:r>
+        <w:rPr>
+          <w:rFonts w:ascii="Consolas" w:eastAsia="Times New Roman" w:hAnsi="Consolas" w:cs="Times New Roman"/>
+          <w:color w:val="4EC9B0"/>
+          <w:sz w:val="21"/>
+          <w:szCs w:val="21"/>
+        </w:rPr>
+        <w:t>FastAPI</w:t>
+      </w:r>
+    </w:p>
+    <w:p>
+      <w:pPr>
+        <w:shd w:val="clear" w:color="auto" w:fill="1E1E1E"/>
+        <w:spacing w:after="0" w:line="285" w:lineRule="atLeast"/>
+        <w:rPr>
+          <w:rFonts w:ascii="Consolas" w:eastAsia="Times New Roman" w:hAnsi="Consolas" w:cs="Times New Roman"/>
+          <w:color w:val="D4D4D4"/>
+          <w:sz w:val="21"/>
+          <w:szCs w:val="21"/>
+        </w:rPr>
+      </w:pPr>
+      <w:r>
+        <w:rPr>
+          <w:rFonts w:ascii="Consolas" w:eastAsia="Times New Roman" w:hAnsi="Consolas" w:cs="Times New Roman"/>
+          <w:color w:val="C586C0"/>
+          <w:sz w:val="21"/>
+          <w:szCs w:val="21"/>
+        </w:rPr>
+        <w:t>from</w:t>
+      </w:r>
+      <w:r>
+        <w:rPr>
+          <w:rFonts w:ascii="Consolas" w:eastAsia="Times New Roman" w:hAnsi="Consolas" w:cs="Times New Roman"/>
+          <w:color w:val="D4D4D4"/>
+          <w:sz w:val="21"/>
+          <w:szCs w:val="21"/>
+        </w:rPr>
+        <w:t xml:space="preserve"> </w:t>
+      </w:r>
+      <w:r>
+        <w:rPr>
+          <w:rFonts w:ascii="Consolas" w:eastAsia="Times New Roman" w:hAnsi="Consolas" w:cs="Times New Roman"/>
+          <w:color w:val="4EC9B0"/>
+          <w:sz w:val="21"/>
+          <w:szCs w:val="21"/>
+        </w:rPr>
+        <w:t>user</w:t>
+      </w:r>
+      <w:r>
+        <w:rPr>
+          <w:rFonts w:ascii="Consolas" w:eastAsia="Times New Roman" w:hAnsi="Consolas" w:cs="Times New Roman"/>
+          <w:color w:val="D4D4D4"/>
+          <w:sz w:val="21"/>
+          <w:szCs w:val="21"/>
+        </w:rPr>
+        <w:t>.</w:t>
+      </w:r>
+      <w:r>
+        <w:rPr>
+          <w:rFonts w:ascii="Consolas" w:eastAsia="Times New Roman" w:hAnsi="Consolas" w:cs="Times New Roman"/>
+          <w:color w:val="4EC9B0"/>
+          <w:sz w:val="21"/>
+          <w:szCs w:val="21"/>
+        </w:rPr>
+        <w:t>routers</w:t>
+      </w:r>
+      <w:r>
+        <w:rPr>
+          <w:rFonts w:ascii="Consolas" w:eastAsia="Times New Roman" w:hAnsi="Consolas" w:cs="Times New Roman"/>
+          <w:color w:val="D4D4D4"/>
+          <w:sz w:val="21"/>
+          <w:szCs w:val="21"/>
+        </w:rPr>
+        <w:t xml:space="preserve"> </w:t>
+      </w:r>
+      <w:r>
+        <w:rPr>
+          <w:rFonts w:ascii="Consolas" w:eastAsia="Times New Roman" w:hAnsi="Consolas" w:cs="Times New Roman"/>
+          <w:color w:val="C586C0"/>
+          <w:sz w:val="21"/>
+          <w:szCs w:val="21"/>
+        </w:rPr>
+        <w:t>import</w:t>
+      </w:r>
+      <w:r>
+        <w:rPr>
+          <w:rFonts w:ascii="Consolas" w:eastAsia="Times New Roman" w:hAnsi="Consolas" w:cs="Times New Roman"/>
+          <w:color w:val="D4D4D4"/>
+          <w:sz w:val="21"/>
+          <w:szCs w:val="21"/>
+        </w:rPr>
+        <w:t xml:space="preserve"> </w:t>
+      </w:r>
+      <w:r>
+        <w:rPr>
+          <w:rFonts w:ascii="Consolas" w:eastAsia="Times New Roman" w:hAnsi="Consolas" w:cs="Times New Roman"/>
+          <w:color w:val="9CDCFE"/>
+          <w:sz w:val="21"/>
+          <w:szCs w:val="21"/>
+        </w:rPr>
+        <w:t>router</w:t>
+      </w:r>
+      <w:r>
+        <w:rPr>
+          <w:rFonts w:ascii="Consolas" w:eastAsia="Times New Roman" w:hAnsi="Consolas" w:cs="Times New Roman"/>
+          <w:color w:val="D4D4D4"/>
+          <w:sz w:val="21"/>
+          <w:szCs w:val="21"/>
+        </w:rPr>
+        <w:t xml:space="preserve"> </w:t>
+      </w:r>
+      <w:r>
+        <w:rPr>
+          <w:rFonts w:ascii="Consolas" w:eastAsia="Times New Roman" w:hAnsi="Consolas" w:cs="Times New Roman"/>
+          <w:color w:val="C586C0"/>
+          <w:sz w:val="21"/>
+          <w:szCs w:val="21"/>
+        </w:rPr>
+        <w:t>as</w:t>
+      </w:r>
+      <w:r>
+        <w:rPr>
+          <w:rFonts w:ascii="Consolas" w:eastAsia="Times New Roman" w:hAnsi="Consolas" w:cs="Times New Roman"/>
+          <w:color w:val="D4D4D4"/>
+          <w:sz w:val="21"/>
+          <w:szCs w:val="21"/>
+        </w:rPr>
+        <w:t xml:space="preserve"> </w:t>
+      </w:r>
+      <w:r>
+        <w:rPr>
+          <w:rFonts w:ascii="Consolas" w:eastAsia="Times New Roman" w:hAnsi="Consolas" w:cs="Times New Roman"/>
+          <w:color w:val="9CDCFE"/>
+          <w:sz w:val="21"/>
+          <w:szCs w:val="21"/>
+        </w:rPr>
+        <w:t>user_router</w:t>
+      </w:r>
+    </w:p>
+    <w:p>
+      <w:pPr>
+        <w:shd w:val="clear" w:color="auto" w:fill="1E1E1E"/>
+        <w:spacing w:after="0" w:line="285" w:lineRule="atLeast"/>
+        <w:rPr>
+          <w:rFonts w:ascii="Consolas" w:eastAsia="Times New Roman" w:hAnsi="Consolas" w:cs="Times New Roman"/>
+          <w:color w:val="D4D4D4"/>
+          <w:sz w:val="21"/>
+          <w:szCs w:val="21"/>
+        </w:rPr>
+      </w:pPr>
+      <w:r>
+        <w:rPr>
+          <w:rFonts w:ascii="Consolas" w:eastAsia="Times New Roman" w:hAnsi="Consolas" w:cs="Times New Roman"/>
+          <w:color w:val="C586C0"/>
+          <w:sz w:val="21"/>
+          <w:szCs w:val="21"/>
+        </w:rPr>
+        <w:t>from</w:t>
+      </w:r>
+      <w:r>
+        <w:rPr>
+          <w:rFonts w:ascii="Consolas" w:eastAsia="Times New Roman" w:hAnsi="Consolas" w:cs="Times New Roman"/>
+          <w:color w:val="D4D4D4"/>
+          <w:sz w:val="21"/>
+          <w:szCs w:val="21"/>
+        </w:rPr>
+        <w:t xml:space="preserve"> </w:t>
+      </w:r>
+      <w:r>
+        <w:rPr>
+          <w:rFonts w:ascii="Consolas" w:eastAsia="Times New Roman" w:hAnsi="Consolas" w:cs="Times New Roman"/>
+          <w:color w:val="4EC9B0"/>
+          <w:sz w:val="21"/>
+          <w:szCs w:val="21"/>
+        </w:rPr>
+        <w:t>product</w:t>
+      </w:r>
+      <w:r>
+        <w:rPr>
+          <w:rFonts w:ascii="Consolas" w:eastAsia="Times New Roman" w:hAnsi="Consolas" w:cs="Times New Roman"/>
+          <w:color w:val="D4D4D4"/>
+          <w:sz w:val="21"/>
+          <w:szCs w:val="21"/>
+        </w:rPr>
+        <w:t>.</w:t>
+      </w:r>
+      <w:r>
+        <w:rPr>
+          <w:rFonts w:ascii="Consolas" w:eastAsia="Times New Roman" w:hAnsi="Consolas" w:cs="Times New Roman"/>
+          <w:color w:val="4EC9B0"/>
+          <w:sz w:val="21"/>
+          <w:szCs w:val="21"/>
+        </w:rPr>
+        <w:t>routers</w:t>
+      </w:r>
+      <w:r>
+        <w:rPr>
+          <w:rFonts w:ascii="Consolas" w:eastAsia="Times New Roman" w:hAnsi="Consolas" w:cs="Times New Roman"/>
+          <w:color w:val="D4D4D4"/>
+          <w:sz w:val="21"/>
+          <w:szCs w:val="21"/>
+        </w:rPr>
+        <w:t xml:space="preserve"> </w:t>
+      </w:r>
+      <w:r>
+        <w:rPr>
+          <w:rFonts w:ascii="Consolas" w:eastAsia="Times New Roman" w:hAnsi="Consolas" w:cs="Times New Roman"/>
+          <w:color w:val="C586C0"/>
+          <w:sz w:val="21"/>
+          <w:szCs w:val="21"/>
+        </w:rPr>
+        <w:t>import</w:t>
+      </w:r>
+      <w:r>
+        <w:rPr>
+          <w:rFonts w:ascii="Consolas" w:eastAsia="Times New Roman" w:hAnsi="Consolas" w:cs="Times New Roman"/>
+          <w:color w:val="D4D4D4"/>
+          <w:sz w:val="21"/>
+          <w:szCs w:val="21"/>
+        </w:rPr>
+        <w:t xml:space="preserve"> router </w:t>
+      </w:r>
+      <w:r>
+        <w:rPr>
+          <w:rFonts w:ascii="Consolas" w:eastAsia="Times New Roman" w:hAnsi="Consolas" w:cs="Times New Roman"/>
+          <w:color w:val="C586C0"/>
+          <w:sz w:val="21"/>
+          <w:szCs w:val="21"/>
+        </w:rPr>
+        <w:t>as</w:t>
+      </w:r>
+      <w:r>
+        <w:rPr>
+          <w:rFonts w:ascii="Consolas" w:eastAsia="Times New Roman" w:hAnsi="Consolas" w:cs="Times New Roman"/>
+          <w:color w:val="D4D4D4"/>
+          <w:sz w:val="21"/>
+          <w:szCs w:val="21"/>
+        </w:rPr>
+        <w:t xml:space="preserve"> product_router</w:t>
+      </w:r>
+    </w:p>
+    <w:p>
+      <w:pPr>
+        <w:shd w:val="clear" w:color="auto" w:fill="1E1E1E"/>
+        <w:spacing w:after="0" w:line="285" w:lineRule="atLeast"/>
+        <w:rPr>
+          <w:rFonts w:ascii="Consolas" w:eastAsia="Times New Roman" w:hAnsi="Consolas" w:cs="Times New Roman"/>
+          <w:color w:val="D4D4D4"/>
+          <w:sz w:val="21"/>
+          <w:szCs w:val="21"/>
+        </w:rPr>
+      </w:pPr>
+    </w:p>
+    <w:p>
+      <w:pPr>
+        <w:shd w:val="clear" w:color="auto" w:fill="1E1E1E"/>
+        <w:spacing w:after="0" w:line="285" w:lineRule="atLeast"/>
+        <w:rPr>
+          <w:rFonts w:ascii="Consolas" w:eastAsia="Times New Roman" w:hAnsi="Consolas" w:cs="Times New Roman"/>
+          <w:color w:val="D4D4D4"/>
+          <w:sz w:val="21"/>
+          <w:szCs w:val="21"/>
+        </w:rPr>
+      </w:pPr>
+      <w:r>
+        <w:rPr>
+          <w:rFonts w:ascii="Consolas" w:eastAsia="Times New Roman" w:hAnsi="Consolas" w:cs="Times New Roman"/>
+          <w:color w:val="9CDCFE"/>
+          <w:sz w:val="21"/>
+          <w:szCs w:val="21"/>
+        </w:rPr>
+        <w:t>app</w:t>
+      </w:r>
+      <w:r>
+        <w:rPr>
+          <w:rFonts w:ascii="Consolas" w:eastAsia="Times New Roman" w:hAnsi="Consolas" w:cs="Times New Roman"/>
+          <w:color w:val="D4D4D4"/>
+          <w:sz w:val="21"/>
+          <w:szCs w:val="21"/>
+        </w:rPr>
+        <w:t xml:space="preserve"> = </w:t>
+      </w:r>
+      <w:r>
+        <w:rPr>
+          <w:rFonts w:ascii="Consolas" w:eastAsia="Times New Roman" w:hAnsi="Consolas" w:cs="Times New Roman"/>
+          <w:color w:val="4EC9B0"/>
+          <w:sz w:val="21"/>
+          <w:szCs w:val="21"/>
+        </w:rPr>
+        <w:t>FastAPI</w:t>
+      </w:r>
+      <w:r>
+        <w:rPr>
+          <w:rFonts w:ascii="Consolas" w:eastAsia="Times New Roman" w:hAnsi="Consolas" w:cs="Times New Roman"/>
+          <w:color w:val="D4D4D4"/>
+          <w:sz w:val="21"/>
+          <w:szCs w:val="21"/>
+        </w:rPr>
+        <w:t>()</w:t>
+      </w:r>
+    </w:p>
+    <w:p>
+      <w:pPr>
+        <w:shd w:val="clear" w:color="auto" w:fill="1E1E1E"/>
+        <w:spacing w:after="0" w:line="285" w:lineRule="atLeast"/>
+        <w:rPr>
+          <w:rFonts w:ascii="Consolas" w:eastAsia="Times New Roman" w:hAnsi="Consolas" w:cs="Times New Roman"/>
+          <w:color w:val="D4D4D4"/>
+          <w:sz w:val="21"/>
+          <w:szCs w:val="21"/>
+        </w:rPr>
+      </w:pPr>
+    </w:p>
+    <w:p>
+      <w:pPr>
+        <w:shd w:val="clear" w:color="auto" w:fill="1E1E1E"/>
+        <w:spacing w:after="0" w:line="285" w:lineRule="atLeast"/>
+        <w:rPr>
+          <w:rFonts w:ascii="Consolas" w:eastAsia="Times New Roman" w:hAnsi="Consolas" w:cs="Times New Roman"/>
+          <w:color w:val="D4D4D4"/>
+          <w:sz w:val="21"/>
+          <w:szCs w:val="21"/>
+        </w:rPr>
+      </w:pPr>
+      <w:r>
+        <w:rPr>
+          <w:rFonts w:ascii="Consolas" w:eastAsia="Times New Roman" w:hAnsi="Consolas" w:cs="Times New Roman"/>
+          <w:color w:val="9CDCFE"/>
+          <w:sz w:val="21"/>
+          <w:szCs w:val="21"/>
+        </w:rPr>
+        <w:t>app</w:t>
+      </w:r>
+      <w:r>
+        <w:rPr>
+          <w:rFonts w:ascii="Consolas" w:eastAsia="Times New Roman" w:hAnsi="Consolas" w:cs="Times New Roman"/>
+          <w:color w:val="D4D4D4"/>
+          <w:sz w:val="21"/>
+          <w:szCs w:val="21"/>
+        </w:rPr>
+        <w:t>.</w:t>
+      </w:r>
+      <w:r>
+        <w:rPr>
+          <w:rFonts w:ascii="Consolas" w:eastAsia="Times New Roman" w:hAnsi="Consolas" w:cs="Times New Roman"/>
+          <w:color w:val="DCDCAA"/>
+          <w:sz w:val="21"/>
+          <w:szCs w:val="21"/>
+        </w:rPr>
+        <w:t>include_router</w:t>
+      </w:r>
+      <w:r>
+        <w:rPr>
+          <w:rFonts w:ascii="Consolas" w:eastAsia="Times New Roman" w:hAnsi="Consolas" w:cs="Times New Roman"/>
+          <w:color w:val="D4D4D4"/>
+          <w:sz w:val="21"/>
+          <w:szCs w:val="21"/>
+        </w:rPr>
+        <w:t>(</w:t>
+      </w:r>
+      <w:r>
+        <w:rPr>
+          <w:rFonts w:ascii="Consolas" w:eastAsia="Times New Roman" w:hAnsi="Consolas" w:cs="Times New Roman"/>
+          <w:color w:val="9CDCFE"/>
+          <w:sz w:val="21"/>
+          <w:szCs w:val="21"/>
+        </w:rPr>
+        <w:t>user_router</w:t>
+      </w:r>
+      <w:r>
+        <w:rPr>
+          <w:rFonts w:ascii="Consolas" w:eastAsia="Times New Roman" w:hAnsi="Consolas" w:cs="Times New Roman"/>
+          <w:color w:val="D4D4D4"/>
+          <w:sz w:val="21"/>
+          <w:szCs w:val="21"/>
+        </w:rPr>
+        <w:t>)</w:t>
+      </w:r>
+    </w:p>
+    <w:p>
+      <w:pPr>
+        <w:shd w:val="clear" w:color="auto" w:fill="1E1E1E"/>
+        <w:spacing w:after="0" w:line="285" w:lineRule="atLeast"/>
+        <w:rPr>
+          <w:rFonts w:ascii="Consolas" w:eastAsia="Times New Roman" w:hAnsi="Consolas" w:cs="Times New Roman"/>
+          <w:color w:val="D4D4D4"/>
+          <w:sz w:val="21"/>
+          <w:szCs w:val="21"/>
+        </w:rPr>
+      </w:pPr>
+      <w:r>
+        <w:rPr>
+          <w:rFonts w:ascii="Consolas" w:eastAsia="Times New Roman" w:hAnsi="Consolas" w:cs="Times New Roman"/>
+          <w:color w:val="9CDCFE"/>
+          <w:sz w:val="21"/>
+          <w:szCs w:val="21"/>
+        </w:rPr>
+        <w:t>app</w:t>
+      </w:r>
+      <w:r>
+        <w:rPr>
+          <w:rFonts w:ascii="Consolas" w:eastAsia="Times New Roman" w:hAnsi="Consolas" w:cs="Times New Roman"/>
+          <w:color w:val="D4D4D4"/>
+          <w:sz w:val="21"/>
+          <w:szCs w:val="21"/>
+        </w:rPr>
+        <w:t>.</w:t>
+      </w:r>
+      <w:r>
+        <w:rPr>
+          <w:rFonts w:ascii="Consolas" w:eastAsia="Times New Roman" w:hAnsi="Consolas" w:cs="Times New Roman"/>
+          <w:color w:val="DCDCAA"/>
+          <w:sz w:val="21"/>
+          <w:szCs w:val="21"/>
+        </w:rPr>
+        <w:t>include_router</w:t>
+      </w:r>
+      <w:r>
+        <w:rPr>
+          <w:rFonts w:ascii="Consolas" w:eastAsia="Times New Roman" w:hAnsi="Consolas" w:cs="Times New Roman"/>
+          <w:color w:val="D4D4D4"/>
+          <w:sz w:val="21"/>
+          <w:szCs w:val="21"/>
+        </w:rPr>
+        <w:t>(product_router)</w:t>
+      </w:r>
+    </w:p>
+    <w:p>
+      <w:pPr>
+        <w:shd w:val="clear" w:color="auto" w:fill="1E1E1E"/>
+        <w:spacing w:after="0" w:line="285" w:lineRule="atLeast"/>
+        <w:rPr>
+          <w:rFonts w:ascii="Consolas" w:eastAsia="Times New Roman" w:hAnsi="Consolas" w:cs="Times New Roman"/>
+          <w:color w:val="D4D4D4"/>
+          <w:sz w:val="21"/>
+          <w:szCs w:val="21"/>
+        </w:rPr>
+      </w:pPr>
+    </w:p>
+    <w:p>
+      <w:r>
+        <w:pict>
           <v:rect id="_x0000_i1029" style="width:0;height:1.5pt" o:hralign="center" o:hrstd="t" o:hr="t" fillcolor="#a0a0a0" stroked="f"/>
         </w:pict>
       </w:r>
@@ -2222,118 +3433,46 @@
         <w:rPr>
           <w:rFonts w:ascii="Segoe UI Symbol" w:hAnsi="Segoe UI Symbol" w:cs="Segoe UI Symbol"/>
         </w:rPr>
+        <w:lastRenderedPageBreak/>
         <w:t>🔹</w:t>
       </w:r>
       <w:r>
-        <w:t xml:space="preserve"> Example 2: Product Router</w:t>
-      </w:r>
-    </w:p>
-    <w:p>
-      <w:pPr>
-        <w:pStyle w:val="Heading2"/>
-      </w:pPr>
+        <w:t xml:space="preserve"> Best Practices (Important </w:t>
+      </w:r>
       <w:r>
         <w:rPr>
           <w:rFonts w:ascii="Segoe UI Symbol" w:hAnsi="Segoe UI Symbol" w:cs="Segoe UI Symbol"/>
         </w:rPr>
-        <w:t>📁</w:t>
-      </w:r>
-      <w:r>
-        <w:t xml:space="preserve"> </w:t>
+        <w:t>🚀</w:t>
+      </w:r>
+      <w:r>
+        <w:t>)</w:t>
+      </w:r>
+    </w:p>
+    <w:p>
+      <w:pPr>
+        <w:pStyle w:val="Heading3"/>
+      </w:pPr>
+      <w:r>
+        <w:t>1. Use Prefixes</w:t>
+      </w:r>
+    </w:p>
+    <w:p>
+      <w:pPr>
+        <w:pStyle w:val="NormalWeb"/>
+      </w:pPr>
+      <w:r>
+        <w:t xml:space="preserve">Instead of repeating </w:t>
       </w:r>
       <w:r>
         <w:rPr>
           <w:rStyle w:val="HTMLCode"/>
         </w:rPr>
-        <w:t>product/routers.py</w:t>
-      </w:r>
-    </w:p>
-    <w:p>
-      <w:pPr>
-        <w:shd w:val="clear" w:color="auto" w:fill="1E1E1E"/>
-        <w:spacing w:after="0" w:line="285" w:lineRule="atLeast"/>
-        <w:rPr>
-          <w:rFonts w:ascii="Consolas" w:eastAsia="Times New Roman" w:hAnsi="Consolas" w:cs="Times New Roman"/>
-          <w:color w:val="D4D4D4"/>
-          <w:sz w:val="21"/>
-          <w:szCs w:val="21"/>
-        </w:rPr>
-      </w:pPr>
-      <w:r>
-        <w:rPr>
-          <w:rFonts w:ascii="Consolas" w:eastAsia="Times New Roman" w:hAnsi="Consolas" w:cs="Times New Roman"/>
-          <w:color w:val="C586C0"/>
-          <w:sz w:val="21"/>
-          <w:szCs w:val="21"/>
-        </w:rPr>
-        <w:t>from</w:t>
-      </w:r>
-      <w:r>
-        <w:rPr>
-          <w:rFonts w:ascii="Consolas" w:eastAsia="Times New Roman" w:hAnsi="Consolas" w:cs="Times New Roman"/>
-          <w:color w:val="D4D4D4"/>
-          <w:sz w:val="21"/>
-          <w:szCs w:val="21"/>
-        </w:rPr>
-        <w:t xml:space="preserve"> </w:t>
-      </w:r>
-      <w:r>
-        <w:rPr>
-          <w:rFonts w:ascii="Consolas" w:eastAsia="Times New Roman" w:hAnsi="Consolas" w:cs="Times New Roman"/>
-          <w:color w:val="4EC9B0"/>
-          <w:sz w:val="21"/>
-          <w:szCs w:val="21"/>
-        </w:rPr>
-        <w:t>fastapi</w:t>
-      </w:r>
-      <w:r>
-        <w:rPr>
-          <w:rFonts w:ascii="Consolas" w:eastAsia="Times New Roman" w:hAnsi="Consolas" w:cs="Times New Roman"/>
-          <w:color w:val="D4D4D4"/>
-          <w:sz w:val="21"/>
-          <w:szCs w:val="21"/>
-        </w:rPr>
-        <w:t xml:space="preserve"> </w:t>
-      </w:r>
-      <w:r>
-        <w:rPr>
-          <w:rFonts w:ascii="Consolas" w:eastAsia="Times New Roman" w:hAnsi="Consolas" w:cs="Times New Roman"/>
-          <w:color w:val="C586C0"/>
-          <w:sz w:val="21"/>
-          <w:szCs w:val="21"/>
-        </w:rPr>
-        <w:t>import</w:t>
-      </w:r>
-      <w:r>
-        <w:rPr>
-          <w:rFonts w:ascii="Consolas" w:eastAsia="Times New Roman" w:hAnsi="Consolas" w:cs="Times New Roman"/>
-          <w:color w:val="D4D4D4"/>
-          <w:sz w:val="21"/>
-          <w:szCs w:val="21"/>
-        </w:rPr>
-        <w:t xml:space="preserve"> </w:t>
-      </w:r>
-      <w:r>
-        <w:rPr>
-          <w:rFonts w:ascii="Consolas" w:eastAsia="Times New Roman" w:hAnsi="Consolas" w:cs="Times New Roman"/>
-          <w:color w:val="4EC9B0"/>
-          <w:sz w:val="21"/>
-          <w:szCs w:val="21"/>
-        </w:rPr>
-        <w:t>APIRouter</w:t>
-      </w:r>
-    </w:p>
-    <w:p>
-      <w:pPr>
-        <w:shd w:val="clear" w:color="auto" w:fill="1E1E1E"/>
-        <w:spacing w:after="0" w:line="285" w:lineRule="atLeast"/>
-        <w:rPr>
-          <w:rFonts w:ascii="Consolas" w:eastAsia="Times New Roman" w:hAnsi="Consolas" w:cs="Times New Roman"/>
-          <w:color w:val="D4D4D4"/>
-          <w:sz w:val="21"/>
-          <w:szCs w:val="21"/>
-        </w:rPr>
-      </w:pPr>
+        <w:t>/users</w:t>
+      </w:r>
+      <w:r>
+        <w:t>, do this:</w:t>
+      </w:r>
     </w:p>
     <w:p>
       <w:pPr>
@@ -2362,38 +3501,52 @@
           <w:sz w:val="21"/>
           <w:szCs w:val="21"/>
         </w:rPr>
-        <w:t xml:space="preserve"> = </w:t>
-      </w:r>
-      <w:r>
-        <w:rPr>
-          <w:rFonts w:ascii="Consolas" w:eastAsia="Times New Roman" w:hAnsi="Consolas" w:cs="Times New Roman"/>
-          <w:color w:val="4EC9B0"/>
-          <w:sz w:val="21"/>
-          <w:szCs w:val="21"/>
-        </w:rPr>
-        <w:t>APIRouter</w:t>
-      </w:r>
-      <w:r>
-        <w:rPr>
-          <w:rFonts w:ascii="Consolas" w:eastAsia="Times New Roman" w:hAnsi="Consolas" w:cs="Times New Roman"/>
-          <w:color w:val="D4D4D4"/>
-          <w:sz w:val="21"/>
-          <w:szCs w:val="21"/>
-        </w:rPr>
-        <w:t>()</w:t>
-      </w:r>
-    </w:p>
-    <w:p>
-      <w:pPr>
-        <w:shd w:val="clear" w:color="auto" w:fill="1E1E1E"/>
-        <w:spacing w:after="0" w:line="285" w:lineRule="atLeast"/>
-        <w:rPr>
-          <w:rFonts w:ascii="Consolas" w:eastAsia="Times New Roman" w:hAnsi="Consolas" w:cs="Times New Roman"/>
-          <w:color w:val="D4D4D4"/>
-          <w:sz w:val="21"/>
-          <w:szCs w:val="21"/>
-        </w:rPr>
-      </w:pPr>
+        <w:t xml:space="preserve"> = APIRouter(</w:t>
+      </w:r>
+      <w:r>
+        <w:rPr>
+          <w:rFonts w:ascii="Consolas" w:eastAsia="Times New Roman" w:hAnsi="Consolas" w:cs="Times New Roman"/>
+          <w:color w:val="9CDCFE"/>
+          <w:sz w:val="21"/>
+          <w:szCs w:val="21"/>
+        </w:rPr>
+        <w:t>prefix</w:t>
+      </w:r>
+      <w:r>
+        <w:rPr>
+          <w:rFonts w:ascii="Consolas" w:eastAsia="Times New Roman" w:hAnsi="Consolas" w:cs="Times New Roman"/>
+          <w:color w:val="D4D4D4"/>
+          <w:sz w:val="21"/>
+          <w:szCs w:val="21"/>
+        </w:rPr>
+        <w:t>=</w:t>
+      </w:r>
+      <w:r>
+        <w:rPr>
+          <w:rFonts w:ascii="Consolas" w:eastAsia="Times New Roman" w:hAnsi="Consolas" w:cs="Times New Roman"/>
+          <w:color w:val="CE9178"/>
+          <w:sz w:val="21"/>
+          <w:szCs w:val="21"/>
+        </w:rPr>
+        <w:t>"/users"</w:t>
+      </w:r>
+      <w:r>
+        <w:rPr>
+          <w:rFonts w:ascii="Consolas" w:eastAsia="Times New Roman" w:hAnsi="Consolas" w:cs="Times New Roman"/>
+          <w:color w:val="D4D4D4"/>
+          <w:sz w:val="21"/>
+          <w:szCs w:val="21"/>
+        </w:rPr>
+        <w:t>)</w:t>
+      </w:r>
+    </w:p>
+    <w:p>
+      <w:pPr>
+        <w:pStyle w:val="NormalWeb"/>
+      </w:pPr>
+      <w:r>
+        <w:t>Then:</w:t>
+      </w:r>
     </w:p>
     <w:p>
       <w:pPr>
@@ -2413,17 +3566,47 @@
           <w:sz w:val="21"/>
           <w:szCs w:val="21"/>
         </w:rPr>
-        <w:t>@</w:t>
-      </w:r>
-      <w:r>
-        <w:rPr>
-          <w:rFonts w:ascii="Consolas" w:eastAsia="Times New Roman" w:hAnsi="Consolas" w:cs="Times New Roman"/>
-          <w:color w:val="9CDCFE"/>
-          <w:sz w:val="21"/>
-          <w:szCs w:val="21"/>
-        </w:rPr>
-        <w:t>router</w:t>
-      </w:r>
+        <w:t>@router.get</w:t>
+      </w:r>
+      <w:r>
+        <w:rPr>
+          <w:rFonts w:ascii="Consolas" w:eastAsia="Times New Roman" w:hAnsi="Consolas" w:cs="Times New Roman"/>
+          <w:color w:val="D4D4D4"/>
+          <w:sz w:val="21"/>
+          <w:szCs w:val="21"/>
+        </w:rPr>
+        <w:t>(</w:t>
+      </w:r>
+      <w:r>
+        <w:rPr>
+          <w:rFonts w:ascii="Consolas" w:eastAsia="Times New Roman" w:hAnsi="Consolas" w:cs="Times New Roman"/>
+          <w:color w:val="CE9178"/>
+          <w:sz w:val="21"/>
+          <w:szCs w:val="21"/>
+        </w:rPr>
+        <w:t>"/"</w:t>
+      </w:r>
+      <w:r>
+        <w:rPr>
+          <w:rFonts w:ascii="Consolas" w:eastAsia="Times New Roman" w:hAnsi="Consolas" w:cs="Times New Roman"/>
+          <w:color w:val="D4D4D4"/>
+          <w:sz w:val="21"/>
+          <w:szCs w:val="21"/>
+        </w:rPr>
+        <w:t>)</w:t>
+      </w:r>
+    </w:p>
+    <w:p>
+      <w:pPr>
+        <w:shd w:val="clear" w:color="auto" w:fill="1E1E1E"/>
+        <w:spacing w:after="0" w:line="285" w:lineRule="atLeast"/>
+        <w:rPr>
+          <w:rFonts w:ascii="Consolas" w:eastAsia="Times New Roman" w:hAnsi="Consolas" w:cs="Times New Roman"/>
+          <w:color w:val="D4D4D4"/>
+          <w:sz w:val="21"/>
+          <w:szCs w:val="21"/>
+        </w:rPr>
+      </w:pPr>
       <w:r>
         <w:rPr>
           <w:rFonts w:ascii="Consolas" w:eastAsia="Times New Roman" w:hAnsi="Consolas" w:cs="Times New Roman"/>
@@ -2431,7 +3614,7 @@
           <w:sz w:val="21"/>
           <w:szCs w:val="21"/>
         </w:rPr>
-        <w:t>.get</w:t>
+        <w:t>@router.get</w:t>
       </w:r>
       <w:r>
         <w:rPr>
@@ -2449,7 +3632,25 @@
           <w:sz w:val="21"/>
           <w:szCs w:val="21"/>
         </w:rPr>
-        <w:t>"/products"</w:t>
+        <w:t>"/</w:t>
+      </w:r>
+      <w:r>
+        <w:rPr>
+          <w:rFonts w:ascii="Consolas" w:eastAsia="Times New Roman" w:hAnsi="Consolas" w:cs="Times New Roman"/>
+          <w:color w:val="569CD6"/>
+          <w:sz w:val="21"/>
+          <w:szCs w:val="21"/>
+        </w:rPr>
+        <w:t>{user_id}</w:t>
+      </w:r>
+      <w:r>
+        <w:rPr>
+          <w:rFonts w:ascii="Consolas" w:eastAsia="Times New Roman" w:hAnsi="Consolas" w:cs="Times New Roman"/>
+          <w:color w:val="CE9178"/>
+          <w:sz w:val="21"/>
+          <w:szCs w:val="21"/>
+        </w:rPr>
+        <w:t>"</w:t>
       </w:r>
       <w:r>
         <w:rPr>
@@ -2459,420 +3660,6 @@
           <w:szCs w:val="21"/>
         </w:rPr>
         <w:t>)</w:t>
-      </w:r>
-    </w:p>
-    <w:p>
-      <w:pPr>
-        <w:shd w:val="clear" w:color="auto" w:fill="1E1E1E"/>
-        <w:spacing w:after="0" w:line="285" w:lineRule="atLeast"/>
-        <w:rPr>
-          <w:rFonts w:ascii="Consolas" w:eastAsia="Times New Roman" w:hAnsi="Consolas" w:cs="Times New Roman"/>
-          <w:color w:val="D4D4D4"/>
-          <w:sz w:val="21"/>
-          <w:szCs w:val="21"/>
-        </w:rPr>
-      </w:pPr>
-      <w:r>
-        <w:rPr>
-          <w:rFonts w:ascii="Consolas" w:eastAsia="Times New Roman" w:hAnsi="Consolas" w:cs="Times New Roman"/>
-          <w:color w:val="569CD6"/>
-          <w:sz w:val="21"/>
-          <w:szCs w:val="21"/>
-        </w:rPr>
-        <w:t>async</w:t>
-      </w:r>
-      <w:r>
-        <w:rPr>
-          <w:rFonts w:ascii="Consolas" w:eastAsia="Times New Roman" w:hAnsi="Consolas" w:cs="Times New Roman"/>
-          <w:color w:val="D4D4D4"/>
-          <w:sz w:val="21"/>
-          <w:szCs w:val="21"/>
-        </w:rPr>
-        <w:t xml:space="preserve"> </w:t>
-      </w:r>
-      <w:r>
-        <w:rPr>
-          <w:rFonts w:ascii="Consolas" w:eastAsia="Times New Roman" w:hAnsi="Consolas" w:cs="Times New Roman"/>
-          <w:color w:val="569CD6"/>
-          <w:sz w:val="21"/>
-          <w:szCs w:val="21"/>
-        </w:rPr>
-        <w:t>def</w:t>
-      </w:r>
-      <w:r>
-        <w:rPr>
-          <w:rFonts w:ascii="Consolas" w:eastAsia="Times New Roman" w:hAnsi="Consolas" w:cs="Times New Roman"/>
-          <w:color w:val="D4D4D4"/>
-          <w:sz w:val="21"/>
-          <w:szCs w:val="21"/>
-        </w:rPr>
-        <w:t xml:space="preserve"> </w:t>
-      </w:r>
-      <w:r>
-        <w:rPr>
-          <w:rFonts w:ascii="Consolas" w:eastAsia="Times New Roman" w:hAnsi="Consolas" w:cs="Times New Roman"/>
-          <w:color w:val="DCDCAA"/>
-          <w:sz w:val="21"/>
-          <w:szCs w:val="21"/>
-        </w:rPr>
-        <w:t>get_all_products</w:t>
-      </w:r>
-      <w:r>
-        <w:rPr>
-          <w:rFonts w:ascii="Consolas" w:eastAsia="Times New Roman" w:hAnsi="Consolas" w:cs="Times New Roman"/>
-          <w:color w:val="D4D4D4"/>
-          <w:sz w:val="21"/>
-          <w:szCs w:val="21"/>
-        </w:rPr>
-        <w:t>():</w:t>
-      </w:r>
-    </w:p>
-    <w:p>
-      <w:pPr>
-        <w:shd w:val="clear" w:color="auto" w:fill="1E1E1E"/>
-        <w:spacing w:after="0" w:line="285" w:lineRule="atLeast"/>
-        <w:rPr>
-          <w:rFonts w:ascii="Consolas" w:eastAsia="Times New Roman" w:hAnsi="Consolas" w:cs="Times New Roman"/>
-          <w:color w:val="D4D4D4"/>
-          <w:sz w:val="21"/>
-          <w:szCs w:val="21"/>
-        </w:rPr>
-      </w:pPr>
-      <w:r>
-        <w:rPr>
-          <w:rFonts w:ascii="Consolas" w:eastAsia="Times New Roman" w:hAnsi="Consolas" w:cs="Times New Roman"/>
-          <w:color w:val="D4D4D4"/>
-          <w:sz w:val="21"/>
-          <w:szCs w:val="21"/>
-        </w:rPr>
-        <w:t xml:space="preserve">    </w:t>
-      </w:r>
-      <w:r>
-        <w:rPr>
-          <w:rFonts w:ascii="Consolas" w:eastAsia="Times New Roman" w:hAnsi="Consolas" w:cs="Times New Roman"/>
-          <w:color w:val="C586C0"/>
-          <w:sz w:val="21"/>
-          <w:szCs w:val="21"/>
-        </w:rPr>
-        <w:t>return</w:t>
-      </w:r>
-      <w:r>
-        <w:rPr>
-          <w:rFonts w:ascii="Consolas" w:eastAsia="Times New Roman" w:hAnsi="Consolas" w:cs="Times New Roman"/>
-          <w:color w:val="D4D4D4"/>
-          <w:sz w:val="21"/>
-          <w:szCs w:val="21"/>
-        </w:rPr>
-        <w:t xml:space="preserve"> {</w:t>
-      </w:r>
-      <w:r>
-        <w:rPr>
-          <w:rFonts w:ascii="Consolas" w:eastAsia="Times New Roman" w:hAnsi="Consolas" w:cs="Times New Roman"/>
-          <w:color w:val="CE9178"/>
-          <w:sz w:val="21"/>
-          <w:szCs w:val="21"/>
-        </w:rPr>
-        <w:t>"data"</w:t>
-      </w:r>
-      <w:r>
-        <w:rPr>
-          <w:rFonts w:ascii="Consolas" w:eastAsia="Times New Roman" w:hAnsi="Consolas" w:cs="Times New Roman"/>
-          <w:color w:val="D4D4D4"/>
-          <w:sz w:val="21"/>
-          <w:szCs w:val="21"/>
-        </w:rPr>
-        <w:t xml:space="preserve">: </w:t>
-      </w:r>
-      <w:r>
-        <w:rPr>
-          <w:rFonts w:ascii="Consolas" w:eastAsia="Times New Roman" w:hAnsi="Consolas" w:cs="Times New Roman"/>
-          <w:color w:val="CE9178"/>
-          <w:sz w:val="21"/>
-          <w:szCs w:val="21"/>
-        </w:rPr>
-        <w:t>"ALL products"</w:t>
-      </w:r>
-      <w:r>
-        <w:rPr>
-          <w:rFonts w:ascii="Consolas" w:eastAsia="Times New Roman" w:hAnsi="Consolas" w:cs="Times New Roman"/>
-          <w:color w:val="D4D4D4"/>
-          <w:sz w:val="21"/>
-          <w:szCs w:val="21"/>
-        </w:rPr>
-        <w:t>}</w:t>
-      </w:r>
-    </w:p>
-    <w:p>
-      <w:pPr>
-        <w:shd w:val="clear" w:color="auto" w:fill="1E1E1E"/>
-        <w:spacing w:after="0" w:line="285" w:lineRule="atLeast"/>
-        <w:rPr>
-          <w:rFonts w:ascii="Consolas" w:eastAsia="Times New Roman" w:hAnsi="Consolas" w:cs="Times New Roman"/>
-          <w:color w:val="D4D4D4"/>
-          <w:sz w:val="21"/>
-          <w:szCs w:val="21"/>
-        </w:rPr>
-      </w:pPr>
-    </w:p>
-    <w:p>
-      <w:pPr>
-        <w:shd w:val="clear" w:color="auto" w:fill="1E1E1E"/>
-        <w:spacing w:after="0" w:line="285" w:lineRule="atLeast"/>
-        <w:rPr>
-          <w:rFonts w:ascii="Consolas" w:eastAsia="Times New Roman" w:hAnsi="Consolas" w:cs="Times New Roman"/>
-          <w:color w:val="D4D4D4"/>
-          <w:sz w:val="21"/>
-          <w:szCs w:val="21"/>
-        </w:rPr>
-      </w:pPr>
-      <w:r>
-        <w:rPr>
-          <w:rFonts w:ascii="Consolas" w:eastAsia="Times New Roman" w:hAnsi="Consolas" w:cs="Times New Roman"/>
-          <w:color w:val="DCDCAA"/>
-          <w:sz w:val="21"/>
-          <w:szCs w:val="21"/>
-        </w:rPr>
-        <w:t>@</w:t>
-      </w:r>
-      <w:r>
-        <w:rPr>
-          <w:rFonts w:ascii="Consolas" w:eastAsia="Times New Roman" w:hAnsi="Consolas" w:cs="Times New Roman"/>
-          <w:color w:val="9CDCFE"/>
-          <w:sz w:val="21"/>
-          <w:szCs w:val="21"/>
-        </w:rPr>
-        <w:t>router</w:t>
-      </w:r>
-      <w:r>
-        <w:rPr>
-          <w:rFonts w:ascii="Consolas" w:eastAsia="Times New Roman" w:hAnsi="Consolas" w:cs="Times New Roman"/>
-          <w:color w:val="DCDCAA"/>
-          <w:sz w:val="21"/>
-          <w:szCs w:val="21"/>
-        </w:rPr>
-        <w:t>.get</w:t>
-      </w:r>
-      <w:r>
-        <w:rPr>
-          <w:rFonts w:ascii="Consolas" w:eastAsia="Times New Roman" w:hAnsi="Consolas" w:cs="Times New Roman"/>
-          <w:color w:val="D4D4D4"/>
-          <w:sz w:val="21"/>
-          <w:szCs w:val="21"/>
-        </w:rPr>
-        <w:t>(</w:t>
-      </w:r>
-      <w:r>
-        <w:rPr>
-          <w:rFonts w:ascii="Consolas" w:eastAsia="Times New Roman" w:hAnsi="Consolas" w:cs="Times New Roman"/>
-          <w:color w:val="CE9178"/>
-          <w:sz w:val="21"/>
-          <w:szCs w:val="21"/>
-        </w:rPr>
-        <w:t>"/products/</w:t>
-      </w:r>
-      <w:r>
-        <w:rPr>
-          <w:rFonts w:ascii="Consolas" w:eastAsia="Times New Roman" w:hAnsi="Consolas" w:cs="Times New Roman"/>
-          <w:color w:val="569CD6"/>
-          <w:sz w:val="21"/>
-          <w:szCs w:val="21"/>
-        </w:rPr>
-        <w:t>{product_id}</w:t>
-      </w:r>
-      <w:r>
-        <w:rPr>
-          <w:rFonts w:ascii="Consolas" w:eastAsia="Times New Roman" w:hAnsi="Consolas" w:cs="Times New Roman"/>
-          <w:color w:val="CE9178"/>
-          <w:sz w:val="21"/>
-          <w:szCs w:val="21"/>
-        </w:rPr>
-        <w:t>"</w:t>
-      </w:r>
-      <w:r>
-        <w:rPr>
-          <w:rFonts w:ascii="Consolas" w:eastAsia="Times New Roman" w:hAnsi="Consolas" w:cs="Times New Roman"/>
-          <w:color w:val="D4D4D4"/>
-          <w:sz w:val="21"/>
-          <w:szCs w:val="21"/>
-        </w:rPr>
-        <w:t>)</w:t>
-      </w:r>
-    </w:p>
-    <w:p>
-      <w:pPr>
-        <w:shd w:val="clear" w:color="auto" w:fill="1E1E1E"/>
-        <w:spacing w:after="0" w:line="285" w:lineRule="atLeast"/>
-        <w:rPr>
-          <w:rFonts w:ascii="Consolas" w:eastAsia="Times New Roman" w:hAnsi="Consolas" w:cs="Times New Roman"/>
-          <w:color w:val="D4D4D4"/>
-          <w:sz w:val="21"/>
-          <w:szCs w:val="21"/>
-        </w:rPr>
-      </w:pPr>
-      <w:r>
-        <w:rPr>
-          <w:rFonts w:ascii="Consolas" w:eastAsia="Times New Roman" w:hAnsi="Consolas" w:cs="Times New Roman"/>
-          <w:color w:val="569CD6"/>
-          <w:sz w:val="21"/>
-          <w:szCs w:val="21"/>
-        </w:rPr>
-        <w:t>async</w:t>
-      </w:r>
-      <w:r>
-        <w:rPr>
-          <w:rFonts w:ascii="Consolas" w:eastAsia="Times New Roman" w:hAnsi="Consolas" w:cs="Times New Roman"/>
-          <w:color w:val="D4D4D4"/>
-          <w:sz w:val="21"/>
-          <w:szCs w:val="21"/>
-        </w:rPr>
-        <w:t xml:space="preserve"> </w:t>
-      </w:r>
-      <w:r>
-        <w:rPr>
-          <w:rFonts w:ascii="Consolas" w:eastAsia="Times New Roman" w:hAnsi="Consolas" w:cs="Times New Roman"/>
-          <w:color w:val="569CD6"/>
-          <w:sz w:val="21"/>
-          <w:szCs w:val="21"/>
-        </w:rPr>
-        <w:t>def</w:t>
-      </w:r>
-      <w:r>
-        <w:rPr>
-          <w:rFonts w:ascii="Consolas" w:eastAsia="Times New Roman" w:hAnsi="Consolas" w:cs="Times New Roman"/>
-          <w:color w:val="D4D4D4"/>
-          <w:sz w:val="21"/>
-          <w:szCs w:val="21"/>
-        </w:rPr>
-        <w:t xml:space="preserve"> </w:t>
-      </w:r>
-      <w:r>
-        <w:rPr>
-          <w:rFonts w:ascii="Consolas" w:eastAsia="Times New Roman" w:hAnsi="Consolas" w:cs="Times New Roman"/>
-          <w:color w:val="DCDCAA"/>
-          <w:sz w:val="21"/>
-          <w:szCs w:val="21"/>
-        </w:rPr>
-        <w:t>get_single_product</w:t>
-      </w:r>
-      <w:r>
-        <w:rPr>
-          <w:rFonts w:ascii="Consolas" w:eastAsia="Times New Roman" w:hAnsi="Consolas" w:cs="Times New Roman"/>
-          <w:color w:val="D4D4D4"/>
-          <w:sz w:val="21"/>
-          <w:szCs w:val="21"/>
-        </w:rPr>
-        <w:t>(</w:t>
-      </w:r>
-      <w:r>
-        <w:rPr>
-          <w:rFonts w:ascii="Consolas" w:eastAsia="Times New Roman" w:hAnsi="Consolas" w:cs="Times New Roman"/>
-          <w:color w:val="9CDCFE"/>
-          <w:sz w:val="21"/>
-          <w:szCs w:val="21"/>
-        </w:rPr>
-        <w:t>product_id</w:t>
-      </w:r>
-      <w:r>
-        <w:rPr>
-          <w:rFonts w:ascii="Consolas" w:eastAsia="Times New Roman" w:hAnsi="Consolas" w:cs="Times New Roman"/>
-          <w:color w:val="D4D4D4"/>
-          <w:sz w:val="21"/>
-          <w:szCs w:val="21"/>
-        </w:rPr>
-        <w:t xml:space="preserve">: </w:t>
-      </w:r>
-      <w:r>
-        <w:rPr>
-          <w:rFonts w:ascii="Consolas" w:eastAsia="Times New Roman" w:hAnsi="Consolas" w:cs="Times New Roman"/>
-          <w:color w:val="4EC9B0"/>
-          <w:sz w:val="21"/>
-          <w:szCs w:val="21"/>
-        </w:rPr>
-        <w:t>int</w:t>
-      </w:r>
-      <w:r>
-        <w:rPr>
-          <w:rFonts w:ascii="Consolas" w:eastAsia="Times New Roman" w:hAnsi="Consolas" w:cs="Times New Roman"/>
-          <w:color w:val="D4D4D4"/>
-          <w:sz w:val="21"/>
-          <w:szCs w:val="21"/>
-        </w:rPr>
-        <w:t>):</w:t>
-      </w:r>
-    </w:p>
-    <w:p>
-      <w:pPr>
-        <w:shd w:val="clear" w:color="auto" w:fill="1E1E1E"/>
-        <w:spacing w:after="0" w:line="285" w:lineRule="atLeast"/>
-        <w:rPr>
-          <w:rFonts w:ascii="Consolas" w:eastAsia="Times New Roman" w:hAnsi="Consolas" w:cs="Times New Roman"/>
-          <w:color w:val="D4D4D4"/>
-          <w:sz w:val="21"/>
-          <w:szCs w:val="21"/>
-        </w:rPr>
-      </w:pPr>
-      <w:r>
-        <w:rPr>
-          <w:rFonts w:ascii="Consolas" w:eastAsia="Times New Roman" w:hAnsi="Consolas" w:cs="Times New Roman"/>
-          <w:color w:val="D4D4D4"/>
-          <w:sz w:val="21"/>
-          <w:szCs w:val="21"/>
-        </w:rPr>
-        <w:t xml:space="preserve">    </w:t>
-      </w:r>
-      <w:r>
-        <w:rPr>
-          <w:rFonts w:ascii="Consolas" w:eastAsia="Times New Roman" w:hAnsi="Consolas" w:cs="Times New Roman"/>
-          <w:color w:val="C586C0"/>
-          <w:sz w:val="21"/>
-          <w:szCs w:val="21"/>
-        </w:rPr>
-        <w:t>return</w:t>
-      </w:r>
-      <w:r>
-        <w:rPr>
-          <w:rFonts w:ascii="Consolas" w:eastAsia="Times New Roman" w:hAnsi="Consolas" w:cs="Times New Roman"/>
-          <w:color w:val="D4D4D4"/>
-          <w:sz w:val="21"/>
-          <w:szCs w:val="21"/>
-        </w:rPr>
-        <w:t xml:space="preserve"> {</w:t>
-      </w:r>
-      <w:r>
-        <w:rPr>
-          <w:rFonts w:ascii="Consolas" w:eastAsia="Times New Roman" w:hAnsi="Consolas" w:cs="Times New Roman"/>
-          <w:color w:val="CE9178"/>
-          <w:sz w:val="21"/>
-          <w:szCs w:val="21"/>
-        </w:rPr>
-        <w:t>"data"</w:t>
-      </w:r>
-      <w:r>
-        <w:rPr>
-          <w:rFonts w:ascii="Consolas" w:eastAsia="Times New Roman" w:hAnsi="Consolas" w:cs="Times New Roman"/>
-          <w:color w:val="D4D4D4"/>
-          <w:sz w:val="21"/>
-          <w:szCs w:val="21"/>
-        </w:rPr>
-        <w:t xml:space="preserve">: </w:t>
-      </w:r>
-      <w:r>
-        <w:rPr>
-          <w:rFonts w:ascii="Consolas" w:eastAsia="Times New Roman" w:hAnsi="Consolas" w:cs="Times New Roman"/>
-          <w:color w:val="CE9178"/>
-          <w:sz w:val="21"/>
-          <w:szCs w:val="21"/>
-        </w:rPr>
-        <w:t>"Single product"</w:t>
-      </w:r>
-      <w:r>
-        <w:rPr>
-          <w:rFonts w:ascii="Consolas" w:eastAsia="Times New Roman" w:hAnsi="Consolas" w:cs="Times New Roman"/>
-          <w:color w:val="D4D4D4"/>
-          <w:sz w:val="21"/>
-          <w:szCs w:val="21"/>
-        </w:rPr>
-        <w:t>}</w:t>
       </w:r>
     </w:p>
     <w:p>
@@ -2896,182 +3683,23 @@
     </w:p>
     <w:p>
       <w:pPr>
-        <w:pStyle w:val="Heading2"/>
-      </w:pPr>
-      <w:r>
-        <w:rPr>
-          <w:rFonts w:ascii="Segoe UI Symbol" w:hAnsi="Segoe UI Symbol" w:cs="Segoe UI Symbol"/>
-        </w:rPr>
-        <w:t>📁</w:t>
-      </w:r>
-      <w:r>
-        <w:t xml:space="preserve"> Updated </w:t>
-      </w:r>
-      <w:r>
-        <w:rPr>
-          <w:rStyle w:val="HTMLCode"/>
-        </w:rPr>
-        <w:t>main.py</w:t>
-      </w:r>
-    </w:p>
-    <w:p>
-      <w:pPr>
-        <w:shd w:val="clear" w:color="auto" w:fill="1E1E1E"/>
-        <w:spacing w:after="0" w:line="285" w:lineRule="atLeast"/>
-        <w:rPr>
-          <w:rFonts w:ascii="Consolas" w:eastAsia="Times New Roman" w:hAnsi="Consolas" w:cs="Times New Roman"/>
-          <w:color w:val="D4D4D4"/>
-          <w:sz w:val="21"/>
-          <w:szCs w:val="21"/>
-        </w:rPr>
-      </w:pPr>
-      <w:r>
-        <w:rPr>
-          <w:rFonts w:ascii="Consolas" w:eastAsia="Times New Roman" w:hAnsi="Consolas" w:cs="Times New Roman"/>
-          <w:color w:val="C586C0"/>
-          <w:sz w:val="21"/>
-          <w:szCs w:val="21"/>
-        </w:rPr>
-        <w:t>from</w:t>
-      </w:r>
-      <w:r>
-        <w:rPr>
-          <w:rFonts w:ascii="Consolas" w:eastAsia="Times New Roman" w:hAnsi="Consolas" w:cs="Times New Roman"/>
-          <w:color w:val="D4D4D4"/>
-          <w:sz w:val="21"/>
-          <w:szCs w:val="21"/>
-        </w:rPr>
-        <w:t xml:space="preserve"> </w:t>
-      </w:r>
-      <w:r>
-        <w:rPr>
-          <w:rFonts w:ascii="Consolas" w:eastAsia="Times New Roman" w:hAnsi="Consolas" w:cs="Times New Roman"/>
-          <w:color w:val="4EC9B0"/>
-          <w:sz w:val="21"/>
-          <w:szCs w:val="21"/>
-        </w:rPr>
-        <w:t>fastapi</w:t>
-      </w:r>
-      <w:r>
-        <w:rPr>
-          <w:rFonts w:ascii="Consolas" w:eastAsia="Times New Roman" w:hAnsi="Consolas" w:cs="Times New Roman"/>
-          <w:color w:val="D4D4D4"/>
-          <w:sz w:val="21"/>
-          <w:szCs w:val="21"/>
-        </w:rPr>
-        <w:t xml:space="preserve"> </w:t>
-      </w:r>
-      <w:r>
-        <w:rPr>
-          <w:rFonts w:ascii="Consolas" w:eastAsia="Times New Roman" w:hAnsi="Consolas" w:cs="Times New Roman"/>
-          <w:color w:val="C586C0"/>
-          <w:sz w:val="21"/>
-          <w:szCs w:val="21"/>
-        </w:rPr>
-        <w:t>import</w:t>
-      </w:r>
-      <w:r>
-        <w:rPr>
-          <w:rFonts w:ascii="Consolas" w:eastAsia="Times New Roman" w:hAnsi="Consolas" w:cs="Times New Roman"/>
-          <w:color w:val="D4D4D4"/>
-          <w:sz w:val="21"/>
-          <w:szCs w:val="21"/>
-        </w:rPr>
-        <w:t xml:space="preserve"> </w:t>
-      </w:r>
-      <w:r>
-        <w:rPr>
-          <w:rFonts w:ascii="Consolas" w:eastAsia="Times New Roman" w:hAnsi="Consolas" w:cs="Times New Roman"/>
-          <w:color w:val="4EC9B0"/>
-          <w:sz w:val="21"/>
-          <w:szCs w:val="21"/>
-        </w:rPr>
-        <w:t>FastAPI</w:t>
-      </w:r>
-    </w:p>
-    <w:p>
-      <w:pPr>
-        <w:shd w:val="clear" w:color="auto" w:fill="1E1E1E"/>
-        <w:spacing w:after="0" w:line="285" w:lineRule="atLeast"/>
-        <w:rPr>
-          <w:rFonts w:ascii="Consolas" w:eastAsia="Times New Roman" w:hAnsi="Consolas" w:cs="Times New Roman"/>
-          <w:color w:val="D4D4D4"/>
-          <w:sz w:val="21"/>
-          <w:szCs w:val="21"/>
-        </w:rPr>
-      </w:pPr>
-      <w:r>
-        <w:rPr>
-          <w:rFonts w:ascii="Consolas" w:eastAsia="Times New Roman" w:hAnsi="Consolas" w:cs="Times New Roman"/>
-          <w:color w:val="C586C0"/>
-          <w:sz w:val="21"/>
-          <w:szCs w:val="21"/>
-        </w:rPr>
-        <w:t>from</w:t>
-      </w:r>
-      <w:r>
-        <w:rPr>
-          <w:rFonts w:ascii="Consolas" w:eastAsia="Times New Roman" w:hAnsi="Consolas" w:cs="Times New Roman"/>
-          <w:color w:val="D4D4D4"/>
-          <w:sz w:val="21"/>
-          <w:szCs w:val="21"/>
-        </w:rPr>
-        <w:t xml:space="preserve"> </w:t>
-      </w:r>
-      <w:r>
-        <w:rPr>
-          <w:rFonts w:ascii="Consolas" w:eastAsia="Times New Roman" w:hAnsi="Consolas" w:cs="Times New Roman"/>
-          <w:color w:val="4EC9B0"/>
-          <w:sz w:val="21"/>
-          <w:szCs w:val="21"/>
-        </w:rPr>
-        <w:t>user</w:t>
-      </w:r>
-      <w:r>
-        <w:rPr>
-          <w:rFonts w:ascii="Consolas" w:eastAsia="Times New Roman" w:hAnsi="Consolas" w:cs="Times New Roman"/>
-          <w:color w:val="D4D4D4"/>
-          <w:sz w:val="21"/>
-          <w:szCs w:val="21"/>
-        </w:rPr>
-        <w:t>.</w:t>
-      </w:r>
-      <w:r>
-        <w:rPr>
-          <w:rFonts w:ascii="Consolas" w:eastAsia="Times New Roman" w:hAnsi="Consolas" w:cs="Times New Roman"/>
-          <w:color w:val="4EC9B0"/>
-          <w:sz w:val="21"/>
-          <w:szCs w:val="21"/>
-        </w:rPr>
-        <w:t>routers</w:t>
-      </w:r>
-      <w:r>
-        <w:rPr>
-          <w:rFonts w:ascii="Consolas" w:eastAsia="Times New Roman" w:hAnsi="Consolas" w:cs="Times New Roman"/>
-          <w:color w:val="D4D4D4"/>
-          <w:sz w:val="21"/>
-          <w:szCs w:val="21"/>
-        </w:rPr>
-        <w:t xml:space="preserve"> </w:t>
-      </w:r>
-      <w:r>
-        <w:rPr>
-          <w:rFonts w:ascii="Consolas" w:eastAsia="Times New Roman" w:hAnsi="Consolas" w:cs="Times New Roman"/>
-          <w:color w:val="C586C0"/>
-          <w:sz w:val="21"/>
-          <w:szCs w:val="21"/>
-        </w:rPr>
-        <w:t>import</w:t>
-      </w:r>
-      <w:r>
-        <w:rPr>
-          <w:rFonts w:ascii="Consolas" w:eastAsia="Times New Roman" w:hAnsi="Consolas" w:cs="Times New Roman"/>
-          <w:color w:val="D4D4D4"/>
-          <w:sz w:val="21"/>
-          <w:szCs w:val="21"/>
-        </w:rPr>
-        <w:t xml:space="preserve"> </w:t>
-      </w:r>
+        <w:pStyle w:val="Heading3"/>
+      </w:pPr>
+      <w:r>
+        <w:t>2. Use Tags (for Swagger UI)</w:t>
+      </w:r>
+    </w:p>
+    <w:p>
+      <w:pPr>
+        <w:shd w:val="clear" w:color="auto" w:fill="1E1E1E"/>
+        <w:spacing w:after="0" w:line="285" w:lineRule="atLeast"/>
+        <w:rPr>
+          <w:rFonts w:ascii="Consolas" w:eastAsia="Times New Roman" w:hAnsi="Consolas" w:cs="Times New Roman"/>
+          <w:color w:val="D4D4D4"/>
+          <w:sz w:val="21"/>
+          <w:szCs w:val="21"/>
+        </w:rPr>
+      </w:pPr>
       <w:r>
         <w:rPr>
           <w:rFonts w:ascii="Consolas" w:eastAsia="Times New Roman" w:hAnsi="Consolas" w:cs="Times New Roman"/>
@@ -3088,25 +3716,7 @@
           <w:sz w:val="21"/>
           <w:szCs w:val="21"/>
         </w:rPr>
-        <w:t xml:space="preserve"> </w:t>
-      </w:r>
-      <w:r>
-        <w:rPr>
-          <w:rFonts w:ascii="Consolas" w:eastAsia="Times New Roman" w:hAnsi="Consolas" w:cs="Times New Roman"/>
-          <w:color w:val="C586C0"/>
-          <w:sz w:val="21"/>
-          <w:szCs w:val="21"/>
-        </w:rPr>
-        <w:t>as</w:t>
-      </w:r>
-      <w:r>
-        <w:rPr>
-          <w:rFonts w:ascii="Consolas" w:eastAsia="Times New Roman" w:hAnsi="Consolas" w:cs="Times New Roman"/>
-          <w:color w:val="D4D4D4"/>
-          <w:sz w:val="21"/>
-          <w:szCs w:val="21"/>
-        </w:rPr>
-        <w:t xml:space="preserve"> </w:t>
+        <w:t xml:space="preserve"> = APIRouter(</w:t>
       </w:r>
       <w:r>
         <w:rPr>
@@ -3115,134 +3725,35 @@
           <w:sz w:val="21"/>
           <w:szCs w:val="21"/>
         </w:rPr>
-        <w:t>user_router</w:t>
-      </w:r>
-    </w:p>
-    <w:p>
-      <w:pPr>
-        <w:shd w:val="clear" w:color="auto" w:fill="1E1E1E"/>
-        <w:spacing w:after="0" w:line="285" w:lineRule="atLeast"/>
-        <w:rPr>
-          <w:rFonts w:ascii="Consolas" w:eastAsia="Times New Roman" w:hAnsi="Consolas" w:cs="Times New Roman"/>
-          <w:color w:val="D4D4D4"/>
-          <w:sz w:val="21"/>
-          <w:szCs w:val="21"/>
-        </w:rPr>
-      </w:pPr>
-      <w:r>
-        <w:rPr>
-          <w:rFonts w:ascii="Consolas" w:eastAsia="Times New Roman" w:hAnsi="Consolas" w:cs="Times New Roman"/>
-          <w:color w:val="C586C0"/>
-          <w:sz w:val="21"/>
-          <w:szCs w:val="21"/>
-        </w:rPr>
-        <w:t>from</w:t>
-      </w:r>
-      <w:r>
-        <w:rPr>
-          <w:rFonts w:ascii="Consolas" w:eastAsia="Times New Roman" w:hAnsi="Consolas" w:cs="Times New Roman"/>
-          <w:color w:val="D4D4D4"/>
-          <w:sz w:val="21"/>
-          <w:szCs w:val="21"/>
-        </w:rPr>
-        <w:t xml:space="preserve"> </w:t>
-      </w:r>
-      <w:r>
-        <w:rPr>
-          <w:rFonts w:ascii="Consolas" w:eastAsia="Times New Roman" w:hAnsi="Consolas" w:cs="Times New Roman"/>
-          <w:color w:val="4EC9B0"/>
-          <w:sz w:val="21"/>
-          <w:szCs w:val="21"/>
-        </w:rPr>
-        <w:t>product</w:t>
-      </w:r>
-      <w:r>
-        <w:rPr>
-          <w:rFonts w:ascii="Consolas" w:eastAsia="Times New Roman" w:hAnsi="Consolas" w:cs="Times New Roman"/>
-          <w:color w:val="D4D4D4"/>
-          <w:sz w:val="21"/>
-          <w:szCs w:val="21"/>
-        </w:rPr>
-        <w:t>.</w:t>
-      </w:r>
-      <w:r>
-        <w:rPr>
-          <w:rFonts w:ascii="Consolas" w:eastAsia="Times New Roman" w:hAnsi="Consolas" w:cs="Times New Roman"/>
-          <w:color w:val="4EC9B0"/>
-          <w:sz w:val="21"/>
-          <w:szCs w:val="21"/>
-        </w:rPr>
-        <w:t>routers</w:t>
-      </w:r>
-      <w:r>
-        <w:rPr>
-          <w:rFonts w:ascii="Consolas" w:eastAsia="Times New Roman" w:hAnsi="Consolas" w:cs="Times New Roman"/>
-          <w:color w:val="D4D4D4"/>
-          <w:sz w:val="21"/>
-          <w:szCs w:val="21"/>
-        </w:rPr>
-        <w:t xml:space="preserve"> </w:t>
-      </w:r>
-      <w:r>
-        <w:rPr>
-          <w:rFonts w:ascii="Consolas" w:eastAsia="Times New Roman" w:hAnsi="Consolas" w:cs="Times New Roman"/>
-          <w:color w:val="C586C0"/>
-          <w:sz w:val="21"/>
-          <w:szCs w:val="21"/>
-        </w:rPr>
-        <w:t>import</w:t>
-      </w:r>
-      <w:r>
-        <w:rPr>
-          <w:rFonts w:ascii="Consolas" w:eastAsia="Times New Roman" w:hAnsi="Consolas" w:cs="Times New Roman"/>
-          <w:color w:val="D4D4D4"/>
-          <w:sz w:val="21"/>
-          <w:szCs w:val="21"/>
-        </w:rPr>
-        <w:t xml:space="preserve"> router </w:t>
-      </w:r>
-      <w:r>
-        <w:rPr>
-          <w:rFonts w:ascii="Consolas" w:eastAsia="Times New Roman" w:hAnsi="Consolas" w:cs="Times New Roman"/>
-          <w:color w:val="C586C0"/>
-          <w:sz w:val="21"/>
-          <w:szCs w:val="21"/>
-        </w:rPr>
-        <w:t>as</w:t>
-      </w:r>
-      <w:r>
-        <w:rPr>
-          <w:rFonts w:ascii="Consolas" w:eastAsia="Times New Roman" w:hAnsi="Consolas" w:cs="Times New Roman"/>
-          <w:color w:val="D4D4D4"/>
-          <w:sz w:val="21"/>
-          <w:szCs w:val="21"/>
-        </w:rPr>
-        <w:t xml:space="preserve"> product_router</w:t>
-      </w:r>
-    </w:p>
-    <w:p>
-      <w:pPr>
-        <w:shd w:val="clear" w:color="auto" w:fill="1E1E1E"/>
-        <w:spacing w:after="0" w:line="285" w:lineRule="atLeast"/>
-        <w:rPr>
-          <w:rFonts w:ascii="Consolas" w:eastAsia="Times New Roman" w:hAnsi="Consolas" w:cs="Times New Roman"/>
-          <w:color w:val="D4D4D4"/>
-          <w:sz w:val="21"/>
-          <w:szCs w:val="21"/>
-        </w:rPr>
-      </w:pPr>
-    </w:p>
-    <w:p>
-      <w:pPr>
-        <w:shd w:val="clear" w:color="auto" w:fill="1E1E1E"/>
-        <w:spacing w:after="0" w:line="285" w:lineRule="atLeast"/>
-        <w:rPr>
-          <w:rFonts w:ascii="Consolas" w:eastAsia="Times New Roman" w:hAnsi="Consolas" w:cs="Times New Roman"/>
-          <w:color w:val="D4D4D4"/>
-          <w:sz w:val="21"/>
-          <w:szCs w:val="21"/>
-        </w:rPr>
-      </w:pPr>
+        <w:t>prefix</w:t>
+      </w:r>
+      <w:r>
+        <w:rPr>
+          <w:rFonts w:ascii="Consolas" w:eastAsia="Times New Roman" w:hAnsi="Consolas" w:cs="Times New Roman"/>
+          <w:color w:val="D4D4D4"/>
+          <w:sz w:val="21"/>
+          <w:szCs w:val="21"/>
+        </w:rPr>
+        <w:t>=</w:t>
+      </w:r>
+      <w:r>
+        <w:rPr>
+          <w:rFonts w:ascii="Consolas" w:eastAsia="Times New Roman" w:hAnsi="Consolas" w:cs="Times New Roman"/>
+          <w:color w:val="CE9178"/>
+          <w:sz w:val="21"/>
+          <w:szCs w:val="21"/>
+        </w:rPr>
+        <w:t>"/users"</w:t>
+      </w:r>
+      <w:r>
+        <w:rPr>
+          <w:rFonts w:ascii="Consolas" w:eastAsia="Times New Roman" w:hAnsi="Consolas" w:cs="Times New Roman"/>
+          <w:color w:val="D4D4D4"/>
+          <w:sz w:val="21"/>
+          <w:szCs w:val="21"/>
+        </w:rPr>
+        <w:t xml:space="preserve">, </w:t>
+      </w:r>
       <w:r>
         <w:rPr>
           <w:rFonts w:ascii="Consolas" w:eastAsia="Times New Roman" w:hAnsi="Consolas" w:cs="Times New Roman"/>
@@ -3250,173 +3761,43 @@
           <w:sz w:val="21"/>
           <w:szCs w:val="21"/>
         </w:rPr>
-        <w:t>app</w:t>
-      </w:r>
-      <w:r>
-        <w:rPr>
-          <w:rFonts w:ascii="Consolas" w:eastAsia="Times New Roman" w:hAnsi="Consolas" w:cs="Times New Roman"/>
-          <w:color w:val="D4D4D4"/>
-          <w:sz w:val="21"/>
-          <w:szCs w:val="21"/>
-        </w:rPr>
-        <w:t xml:space="preserve"> = </w:t>
-      </w:r>
-      <w:r>
-        <w:rPr>
-          <w:rFonts w:ascii="Consolas" w:eastAsia="Times New Roman" w:hAnsi="Consolas" w:cs="Times New Roman"/>
-          <w:color w:val="4EC9B0"/>
-          <w:sz w:val="21"/>
-          <w:szCs w:val="21"/>
-        </w:rPr>
-        <w:t>FastAPI</w:t>
-      </w:r>
-      <w:r>
-        <w:rPr>
-          <w:rFonts w:ascii="Consolas" w:eastAsia="Times New Roman" w:hAnsi="Consolas" w:cs="Times New Roman"/>
-          <w:color w:val="D4D4D4"/>
-          <w:sz w:val="21"/>
-          <w:szCs w:val="21"/>
-        </w:rPr>
-        <w:t>()</w:t>
-      </w:r>
-    </w:p>
-    <w:p>
-      <w:pPr>
-        <w:shd w:val="clear" w:color="auto" w:fill="1E1E1E"/>
-        <w:spacing w:after="0" w:line="285" w:lineRule="atLeast"/>
-        <w:rPr>
-          <w:rFonts w:ascii="Consolas" w:eastAsia="Times New Roman" w:hAnsi="Consolas" w:cs="Times New Roman"/>
-          <w:color w:val="D4D4D4"/>
-          <w:sz w:val="21"/>
-          <w:szCs w:val="21"/>
-        </w:rPr>
-      </w:pPr>
-    </w:p>
-    <w:p>
-      <w:pPr>
-        <w:shd w:val="clear" w:color="auto" w:fill="1E1E1E"/>
-        <w:spacing w:after="0" w:line="285" w:lineRule="atLeast"/>
-        <w:rPr>
-          <w:rFonts w:ascii="Consolas" w:eastAsia="Times New Roman" w:hAnsi="Consolas" w:cs="Times New Roman"/>
-          <w:color w:val="D4D4D4"/>
-          <w:sz w:val="21"/>
-          <w:szCs w:val="21"/>
-        </w:rPr>
-      </w:pPr>
-      <w:r>
-        <w:rPr>
-          <w:rFonts w:ascii="Consolas" w:eastAsia="Times New Roman" w:hAnsi="Consolas" w:cs="Times New Roman"/>
-          <w:color w:val="9CDCFE"/>
-          <w:sz w:val="21"/>
-          <w:szCs w:val="21"/>
-        </w:rPr>
-        <w:t>app</w:t>
-      </w:r>
-      <w:r>
-        <w:rPr>
-          <w:rFonts w:ascii="Consolas" w:eastAsia="Times New Roman" w:hAnsi="Consolas" w:cs="Times New Roman"/>
-          <w:color w:val="D4D4D4"/>
-          <w:sz w:val="21"/>
-          <w:szCs w:val="21"/>
-        </w:rPr>
-        <w:t>.</w:t>
-      </w:r>
-      <w:r>
-        <w:rPr>
-          <w:rFonts w:ascii="Consolas" w:eastAsia="Times New Roman" w:hAnsi="Consolas" w:cs="Times New Roman"/>
-          <w:color w:val="DCDCAA"/>
-          <w:sz w:val="21"/>
-          <w:szCs w:val="21"/>
-        </w:rPr>
-        <w:t>include_router</w:t>
-      </w:r>
-      <w:r>
-        <w:rPr>
-          <w:rFonts w:ascii="Consolas" w:eastAsia="Times New Roman" w:hAnsi="Consolas" w:cs="Times New Roman"/>
-          <w:color w:val="D4D4D4"/>
-          <w:sz w:val="21"/>
-          <w:szCs w:val="21"/>
-        </w:rPr>
-        <w:t>(</w:t>
-      </w:r>
-      <w:r>
-        <w:rPr>
-          <w:rFonts w:ascii="Consolas" w:eastAsia="Times New Roman" w:hAnsi="Consolas" w:cs="Times New Roman"/>
-          <w:color w:val="9CDCFE"/>
-          <w:sz w:val="21"/>
-          <w:szCs w:val="21"/>
-        </w:rPr>
-        <w:t>user_router</w:t>
-      </w:r>
-      <w:r>
-        <w:rPr>
-          <w:rFonts w:ascii="Consolas" w:eastAsia="Times New Roman" w:hAnsi="Consolas" w:cs="Times New Roman"/>
-          <w:color w:val="D4D4D4"/>
-          <w:sz w:val="21"/>
-          <w:szCs w:val="21"/>
-        </w:rPr>
-        <w:t>)</w:t>
-      </w:r>
-    </w:p>
-    <w:p>
-      <w:pPr>
-        <w:shd w:val="clear" w:color="auto" w:fill="1E1E1E"/>
-        <w:spacing w:after="0" w:line="285" w:lineRule="atLeast"/>
-        <w:rPr>
-          <w:rFonts w:ascii="Consolas" w:eastAsia="Times New Roman" w:hAnsi="Consolas" w:cs="Times New Roman"/>
-          <w:color w:val="D4D4D4"/>
-          <w:sz w:val="21"/>
-          <w:szCs w:val="21"/>
-        </w:rPr>
-      </w:pPr>
-      <w:r>
-        <w:rPr>
-          <w:rFonts w:ascii="Consolas" w:eastAsia="Times New Roman" w:hAnsi="Consolas" w:cs="Times New Roman"/>
-          <w:color w:val="9CDCFE"/>
-          <w:sz w:val="21"/>
-          <w:szCs w:val="21"/>
-        </w:rPr>
-        <w:t>app</w:t>
-      </w:r>
-      <w:r>
-        <w:rPr>
-          <w:rFonts w:ascii="Consolas" w:eastAsia="Times New Roman" w:hAnsi="Consolas" w:cs="Times New Roman"/>
-          <w:color w:val="D4D4D4"/>
-          <w:sz w:val="21"/>
-          <w:szCs w:val="21"/>
-        </w:rPr>
-        <w:t>.</w:t>
-      </w:r>
-      <w:r>
-        <w:rPr>
-          <w:rFonts w:ascii="Consolas" w:eastAsia="Times New Roman" w:hAnsi="Consolas" w:cs="Times New Roman"/>
-          <w:color w:val="DCDCAA"/>
-          <w:sz w:val="21"/>
-          <w:szCs w:val="21"/>
-        </w:rPr>
-        <w:t>include_router</w:t>
-      </w:r>
-      <w:r>
-        <w:rPr>
-          <w:rFonts w:ascii="Consolas" w:eastAsia="Times New Roman" w:hAnsi="Consolas" w:cs="Times New Roman"/>
-          <w:color w:val="D4D4D4"/>
-          <w:sz w:val="21"/>
-          <w:szCs w:val="21"/>
-        </w:rPr>
-        <w:t>(product_router)</w:t>
-      </w:r>
-    </w:p>
-    <w:p>
-      <w:pPr>
-        <w:shd w:val="clear" w:color="auto" w:fill="1E1E1E"/>
-        <w:spacing w:after="0" w:line="285" w:lineRule="atLeast"/>
-        <w:rPr>
-          <w:rFonts w:ascii="Consolas" w:eastAsia="Times New Roman" w:hAnsi="Consolas" w:cs="Times New Roman"/>
-          <w:color w:val="D4D4D4"/>
-          <w:sz w:val="21"/>
-          <w:szCs w:val="21"/>
-        </w:rPr>
-      </w:pPr>
+        <w:t>tags</w:t>
+      </w:r>
+      <w:r>
+        <w:rPr>
+          <w:rFonts w:ascii="Consolas" w:eastAsia="Times New Roman" w:hAnsi="Consolas" w:cs="Times New Roman"/>
+          <w:color w:val="D4D4D4"/>
+          <w:sz w:val="21"/>
+          <w:szCs w:val="21"/>
+        </w:rPr>
+        <w:t>=[</w:t>
+      </w:r>
+      <w:r>
+        <w:rPr>
+          <w:rFonts w:ascii="Consolas" w:eastAsia="Times New Roman" w:hAnsi="Consolas" w:cs="Times New Roman"/>
+          <w:color w:val="CE9178"/>
+          <w:sz w:val="21"/>
+          <w:szCs w:val="21"/>
+        </w:rPr>
+        <w:t>"Users"</w:t>
+      </w:r>
+      <w:r>
+        <w:rPr>
+          <w:rFonts w:ascii="Consolas" w:eastAsia="Times New Roman" w:hAnsi="Consolas" w:cs="Times New Roman"/>
+          <w:color w:val="D4D4D4"/>
+          <w:sz w:val="21"/>
+          <w:szCs w:val="21"/>
+        </w:rPr>
+        <w:t>])</w:t>
+      </w:r>
+    </w:p>
+    <w:p>
+      <w:pPr>
+        <w:pStyle w:val="NormalWeb"/>
+      </w:pPr>
+      <w:r>
+        <w:t>This improves API documentation.</w:t>
+      </w:r>
     </w:p>
     <w:p>
       <w:r>
@@ -3427,34 +3808,10 @@
     </w:p>
     <w:p>
       <w:pPr>
-        <w:pStyle w:val="Heading1"/>
-      </w:pPr>
-      <w:r>
-        <w:rPr>
-          <w:rFonts w:ascii="Segoe UI Symbol" w:hAnsi="Segoe UI Symbol" w:cs="Segoe UI Symbol"/>
-        </w:rPr>
-        <w:lastRenderedPageBreak/>
-        <w:t>🔹</w:t>
-      </w:r>
-      <w:r>
-        <w:t xml:space="preserve"> Best Practices (Important </w:t>
-      </w:r>
-      <w:r>
-        <w:rPr>
-          <w:rFonts w:ascii="Segoe UI Symbol" w:hAnsi="Segoe UI Symbol" w:cs="Segoe UI Symbol"/>
-        </w:rPr>
-        <w:t>🚀</w:t>
-      </w:r>
-      <w:r>
-        <w:t>)</w:t>
-      </w:r>
-    </w:p>
-    <w:p>
-      <w:pPr>
         <w:pStyle w:val="Heading3"/>
       </w:pPr>
       <w:r>
-        <w:t>1. Use Prefixes</w:t>
+        <w:t>3. Consistent Naming</w:t>
       </w:r>
     </w:p>
     <w:p>
@@ -3462,16 +3819,7 @@
         <w:pStyle w:val="NormalWeb"/>
       </w:pPr>
       <w:r>
-        <w:t xml:space="preserve">Instead of repeating </w:t>
-      </w:r>
-      <w:r>
-        <w:rPr>
-          <w:rStyle w:val="HTMLCode"/>
-        </w:rPr>
-        <w:t>/users</w:t>
-      </w:r>
-      <w:r>
-        <w:t>, do this:</w:t>
+        <w:t>Use:</w:t>
       </w:r>
     </w:p>
     <w:p>
@@ -3501,8 +3849,28 @@
           <w:sz w:val="21"/>
           <w:szCs w:val="21"/>
         </w:rPr>
-        <w:t xml:space="preserve"> = APIRouter(</w:t>
-      </w:r>
+        <w:t xml:space="preserve"> = APIRouter()</w:t>
+      </w:r>
+    </w:p>
+    <w:p>
+      <w:pPr>
+        <w:pStyle w:val="NormalWeb"/>
+      </w:pPr>
+      <w:r>
+        <w:t>Avoid:</w:t>
+      </w:r>
+    </w:p>
+    <w:p>
+      <w:pPr>
+        <w:shd w:val="clear" w:color="auto" w:fill="1E1E1E"/>
+        <w:spacing w:after="0" w:line="285" w:lineRule="atLeast"/>
+        <w:rPr>
+          <w:rFonts w:ascii="Consolas" w:eastAsia="Times New Roman" w:hAnsi="Consolas" w:cs="Times New Roman"/>
+          <w:color w:val="D4D4D4"/>
+          <w:sz w:val="21"/>
+          <w:szCs w:val="21"/>
+        </w:rPr>
+      </w:pPr>
       <w:r>
         <w:rPr>
           <w:rFonts w:ascii="Consolas" w:eastAsia="Times New Roman" w:hAnsi="Consolas" w:cs="Times New Roman"/>
@@ -3510,395 +3878,27 @@
           <w:sz w:val="21"/>
           <w:szCs w:val="21"/>
         </w:rPr>
-        <w:t>prefix</w:t>
-      </w:r>
-      <w:r>
-        <w:rPr>
-          <w:rFonts w:ascii="Consolas" w:eastAsia="Times New Roman" w:hAnsi="Consolas" w:cs="Times New Roman"/>
-          <w:color w:val="D4D4D4"/>
-          <w:sz w:val="21"/>
-          <w:szCs w:val="21"/>
-        </w:rPr>
-        <w:t>=</w:t>
-      </w:r>
-      <w:r>
-        <w:rPr>
-          <w:rFonts w:ascii="Consolas" w:eastAsia="Times New Roman" w:hAnsi="Consolas" w:cs="Times New Roman"/>
-          <w:color w:val="CE9178"/>
-          <w:sz w:val="21"/>
-          <w:szCs w:val="21"/>
-        </w:rPr>
-        <w:t>"/users"</w:t>
-      </w:r>
-      <w:r>
-        <w:rPr>
-          <w:rFonts w:ascii="Consolas" w:eastAsia="Times New Roman" w:hAnsi="Consolas" w:cs="Times New Roman"/>
-          <w:color w:val="D4D4D4"/>
-          <w:sz w:val="21"/>
-          <w:szCs w:val="21"/>
-        </w:rPr>
-        <w:t>)</w:t>
-      </w:r>
-    </w:p>
-    <w:p>
-      <w:pPr>
-        <w:pStyle w:val="NormalWeb"/>
-      </w:pPr>
-      <w:r>
-        <w:t>Then:</w:t>
-      </w:r>
-    </w:p>
-    <w:p>
-      <w:pPr>
-        <w:shd w:val="clear" w:color="auto" w:fill="1E1E1E"/>
-        <w:spacing w:after="0" w:line="285" w:lineRule="atLeast"/>
-        <w:rPr>
-          <w:rFonts w:ascii="Consolas" w:eastAsia="Times New Roman" w:hAnsi="Consolas" w:cs="Times New Roman"/>
-          <w:color w:val="D4D4D4"/>
-          <w:sz w:val="21"/>
-          <w:szCs w:val="21"/>
-        </w:rPr>
-      </w:pPr>
-      <w:r>
-        <w:rPr>
-          <w:rFonts w:ascii="Consolas" w:eastAsia="Times New Roman" w:hAnsi="Consolas" w:cs="Times New Roman"/>
-          <w:color w:val="DCDCAA"/>
-          <w:sz w:val="21"/>
-          <w:szCs w:val="21"/>
-        </w:rPr>
-        <w:t>@router.get</w:t>
-      </w:r>
-      <w:r>
-        <w:rPr>
-          <w:rFonts w:ascii="Consolas" w:eastAsia="Times New Roman" w:hAnsi="Consolas" w:cs="Times New Roman"/>
-          <w:color w:val="D4D4D4"/>
-          <w:sz w:val="21"/>
-          <w:szCs w:val="21"/>
-        </w:rPr>
-        <w:t>(</w:t>
-      </w:r>
-      <w:r>
-        <w:rPr>
-          <w:rFonts w:ascii="Consolas" w:eastAsia="Times New Roman" w:hAnsi="Consolas" w:cs="Times New Roman"/>
-          <w:color w:val="CE9178"/>
-          <w:sz w:val="21"/>
-          <w:szCs w:val="21"/>
-        </w:rPr>
-        <w:t>"/"</w:t>
-      </w:r>
-      <w:r>
-        <w:rPr>
-          <w:rFonts w:ascii="Consolas" w:eastAsia="Times New Roman" w:hAnsi="Consolas" w:cs="Times New Roman"/>
-          <w:color w:val="D4D4D4"/>
-          <w:sz w:val="21"/>
-          <w:szCs w:val="21"/>
-        </w:rPr>
-        <w:t>)</w:t>
-      </w:r>
-    </w:p>
-    <w:p>
-      <w:pPr>
-        <w:shd w:val="clear" w:color="auto" w:fill="1E1E1E"/>
-        <w:spacing w:after="0" w:line="285" w:lineRule="atLeast"/>
-        <w:rPr>
-          <w:rFonts w:ascii="Consolas" w:eastAsia="Times New Roman" w:hAnsi="Consolas" w:cs="Times New Roman"/>
-          <w:color w:val="D4D4D4"/>
-          <w:sz w:val="21"/>
-          <w:szCs w:val="21"/>
-        </w:rPr>
-      </w:pPr>
-      <w:r>
-        <w:rPr>
-          <w:rFonts w:ascii="Consolas" w:eastAsia="Times New Roman" w:hAnsi="Consolas" w:cs="Times New Roman"/>
-          <w:color w:val="DCDCAA"/>
-          <w:sz w:val="21"/>
-          <w:szCs w:val="21"/>
-        </w:rPr>
-        <w:t>@router.get</w:t>
-      </w:r>
-      <w:r>
-        <w:rPr>
-          <w:rFonts w:ascii="Consolas" w:eastAsia="Times New Roman" w:hAnsi="Consolas" w:cs="Times New Roman"/>
-          <w:color w:val="D4D4D4"/>
-          <w:sz w:val="21"/>
-          <w:szCs w:val="21"/>
-        </w:rPr>
-        <w:t>(</w:t>
-      </w:r>
-      <w:r>
-        <w:rPr>
-          <w:rFonts w:ascii="Consolas" w:eastAsia="Times New Roman" w:hAnsi="Consolas" w:cs="Times New Roman"/>
-          <w:color w:val="CE9178"/>
-          <w:sz w:val="21"/>
-          <w:szCs w:val="21"/>
-        </w:rPr>
-        <w:t>"/</w:t>
-      </w:r>
-      <w:r>
-        <w:rPr>
-          <w:rFonts w:ascii="Consolas" w:eastAsia="Times New Roman" w:hAnsi="Consolas" w:cs="Times New Roman"/>
-          <w:color w:val="569CD6"/>
-          <w:sz w:val="21"/>
-          <w:szCs w:val="21"/>
-        </w:rPr>
-        <w:t>{user_id}</w:t>
-      </w:r>
-      <w:r>
-        <w:rPr>
-          <w:rFonts w:ascii="Consolas" w:eastAsia="Times New Roman" w:hAnsi="Consolas" w:cs="Times New Roman"/>
-          <w:color w:val="CE9178"/>
-          <w:sz w:val="21"/>
-          <w:szCs w:val="21"/>
-        </w:rPr>
-        <w:t>"</w:t>
-      </w:r>
-      <w:r>
-        <w:rPr>
-          <w:rFonts w:ascii="Consolas" w:eastAsia="Times New Roman" w:hAnsi="Consolas" w:cs="Times New Roman"/>
-          <w:color w:val="D4D4D4"/>
-          <w:sz w:val="21"/>
-          <w:szCs w:val="21"/>
-        </w:rPr>
-        <w:t>)</w:t>
-      </w:r>
-    </w:p>
-    <w:p>
-      <w:pPr>
-        <w:shd w:val="clear" w:color="auto" w:fill="1E1E1E"/>
-        <w:spacing w:after="0" w:line="285" w:lineRule="atLeast"/>
-        <w:rPr>
-          <w:rFonts w:ascii="Consolas" w:eastAsia="Times New Roman" w:hAnsi="Consolas" w:cs="Times New Roman"/>
-          <w:color w:val="D4D4D4"/>
-          <w:sz w:val="21"/>
-          <w:szCs w:val="21"/>
-        </w:rPr>
+        <w:t>routers</w:t>
+      </w:r>
+      <w:r>
+        <w:rPr>
+          <w:rFonts w:ascii="Consolas" w:eastAsia="Times New Roman" w:hAnsi="Consolas" w:cs="Times New Roman"/>
+          <w:color w:val="D4D4D4"/>
+          <w:sz w:val="21"/>
+          <w:szCs w:val="21"/>
+        </w:rPr>
+        <w:t xml:space="preserve"> = APIRouter()</w:t>
+      </w:r>
+    </w:p>
+    <w:p>
+      <w:pPr>
+        <w:pStyle w:val="HTMLPreformatted"/>
       </w:pPr>
     </w:p>
     <w:p>
       <w:r>
         <w:pict>
           <v:rect id="_x0000_i1032" style="width:0;height:1.5pt" o:hralign="center" o:hrstd="t" o:hr="t" fillcolor="#a0a0a0" stroked="f"/>
-        </w:pict>
-      </w:r>
-    </w:p>
-    <w:p>
-      <w:pPr>
-        <w:pStyle w:val="Heading3"/>
-      </w:pPr>
-      <w:r>
-        <w:t>2. Use Tags (for Swagger UI)</w:t>
-      </w:r>
-    </w:p>
-    <w:p>
-      <w:pPr>
-        <w:shd w:val="clear" w:color="auto" w:fill="1E1E1E"/>
-        <w:spacing w:after="0" w:line="285" w:lineRule="atLeast"/>
-        <w:rPr>
-          <w:rFonts w:ascii="Consolas" w:eastAsia="Times New Roman" w:hAnsi="Consolas" w:cs="Times New Roman"/>
-          <w:color w:val="D4D4D4"/>
-          <w:sz w:val="21"/>
-          <w:szCs w:val="21"/>
-        </w:rPr>
-      </w:pPr>
-      <w:r>
-        <w:rPr>
-          <w:rFonts w:ascii="Consolas" w:eastAsia="Times New Roman" w:hAnsi="Consolas" w:cs="Times New Roman"/>
-          <w:color w:val="9CDCFE"/>
-          <w:sz w:val="21"/>
-          <w:szCs w:val="21"/>
-        </w:rPr>
-        <w:t>router</w:t>
-      </w:r>
-      <w:r>
-        <w:rPr>
-          <w:rFonts w:ascii="Consolas" w:eastAsia="Times New Roman" w:hAnsi="Consolas" w:cs="Times New Roman"/>
-          <w:color w:val="D4D4D4"/>
-          <w:sz w:val="21"/>
-          <w:szCs w:val="21"/>
-        </w:rPr>
-        <w:t xml:space="preserve"> = APIRouter(</w:t>
-      </w:r>
-      <w:r>
-        <w:rPr>
-          <w:rFonts w:ascii="Consolas" w:eastAsia="Times New Roman" w:hAnsi="Consolas" w:cs="Times New Roman"/>
-          <w:color w:val="9CDCFE"/>
-          <w:sz w:val="21"/>
-          <w:szCs w:val="21"/>
-        </w:rPr>
-        <w:t>prefix</w:t>
-      </w:r>
-      <w:r>
-        <w:rPr>
-          <w:rFonts w:ascii="Consolas" w:eastAsia="Times New Roman" w:hAnsi="Consolas" w:cs="Times New Roman"/>
-          <w:color w:val="D4D4D4"/>
-          <w:sz w:val="21"/>
-          <w:szCs w:val="21"/>
-        </w:rPr>
-        <w:t>=</w:t>
-      </w:r>
-      <w:r>
-        <w:rPr>
-          <w:rFonts w:ascii="Consolas" w:eastAsia="Times New Roman" w:hAnsi="Consolas" w:cs="Times New Roman"/>
-          <w:color w:val="CE9178"/>
-          <w:sz w:val="21"/>
-          <w:szCs w:val="21"/>
-        </w:rPr>
-        <w:t>"/users"</w:t>
-      </w:r>
-      <w:r>
-        <w:rPr>
-          <w:rFonts w:ascii="Consolas" w:eastAsia="Times New Roman" w:hAnsi="Consolas" w:cs="Times New Roman"/>
-          <w:color w:val="D4D4D4"/>
-          <w:sz w:val="21"/>
-          <w:szCs w:val="21"/>
-        </w:rPr>
-        <w:t xml:space="preserve">, </w:t>
-      </w:r>
-      <w:r>
-        <w:rPr>
-          <w:rFonts w:ascii="Consolas" w:eastAsia="Times New Roman" w:hAnsi="Consolas" w:cs="Times New Roman"/>
-          <w:color w:val="9CDCFE"/>
-          <w:sz w:val="21"/>
-          <w:szCs w:val="21"/>
-        </w:rPr>
-        <w:t>tags</w:t>
-      </w:r>
-      <w:r>
-        <w:rPr>
-          <w:rFonts w:ascii="Consolas" w:eastAsia="Times New Roman" w:hAnsi="Consolas" w:cs="Times New Roman"/>
-          <w:color w:val="D4D4D4"/>
-          <w:sz w:val="21"/>
-          <w:szCs w:val="21"/>
-        </w:rPr>
-        <w:t>=[</w:t>
-      </w:r>
-      <w:r>
-        <w:rPr>
-          <w:rFonts w:ascii="Consolas" w:eastAsia="Times New Roman" w:hAnsi="Consolas" w:cs="Times New Roman"/>
-          <w:color w:val="CE9178"/>
-          <w:sz w:val="21"/>
-          <w:szCs w:val="21"/>
-        </w:rPr>
-        <w:t>"Users"</w:t>
-      </w:r>
-      <w:r>
-        <w:rPr>
-          <w:rFonts w:ascii="Consolas" w:eastAsia="Times New Roman" w:hAnsi="Consolas" w:cs="Times New Roman"/>
-          <w:color w:val="D4D4D4"/>
-          <w:sz w:val="21"/>
-          <w:szCs w:val="21"/>
-        </w:rPr>
-        <w:t>])</w:t>
-      </w:r>
-    </w:p>
-    <w:p>
-      <w:pPr>
-        <w:pStyle w:val="NormalWeb"/>
-      </w:pPr>
-      <w:r>
-        <w:t>This improves API documentation.</w:t>
-      </w:r>
-    </w:p>
-    <w:p>
-      <w:r>
-        <w:pict>
-          <v:rect id="_x0000_i1033" style="width:0;height:1.5pt" o:hralign="center" o:hrstd="t" o:hr="t" fillcolor="#a0a0a0" stroked="f"/>
-        </w:pict>
-      </w:r>
-    </w:p>
-    <w:p>
-      <w:pPr>
-        <w:pStyle w:val="Heading3"/>
-      </w:pPr>
-      <w:r>
-        <w:t>3. Consistent Naming</w:t>
-      </w:r>
-    </w:p>
-    <w:p>
-      <w:pPr>
-        <w:pStyle w:val="NormalWeb"/>
-      </w:pPr>
-      <w:r>
-        <w:t>Use:</w:t>
-      </w:r>
-    </w:p>
-    <w:p>
-      <w:pPr>
-        <w:shd w:val="clear" w:color="auto" w:fill="1E1E1E"/>
-        <w:spacing w:after="0" w:line="285" w:lineRule="atLeast"/>
-        <w:rPr>
-          <w:rFonts w:ascii="Consolas" w:eastAsia="Times New Roman" w:hAnsi="Consolas" w:cs="Times New Roman"/>
-          <w:color w:val="D4D4D4"/>
-          <w:sz w:val="21"/>
-          <w:szCs w:val="21"/>
-        </w:rPr>
-      </w:pPr>
-      <w:r>
-        <w:rPr>
-          <w:rFonts w:ascii="Consolas" w:eastAsia="Times New Roman" w:hAnsi="Consolas" w:cs="Times New Roman"/>
-          <w:color w:val="9CDCFE"/>
-          <w:sz w:val="21"/>
-          <w:szCs w:val="21"/>
-        </w:rPr>
-        <w:t>router</w:t>
-      </w:r>
-      <w:r>
-        <w:rPr>
-          <w:rFonts w:ascii="Consolas" w:eastAsia="Times New Roman" w:hAnsi="Consolas" w:cs="Times New Roman"/>
-          <w:color w:val="D4D4D4"/>
-          <w:sz w:val="21"/>
-          <w:szCs w:val="21"/>
-        </w:rPr>
-        <w:t xml:space="preserve"> = APIRouter()</w:t>
-      </w:r>
-    </w:p>
-    <w:p>
-      <w:pPr>
-        <w:pStyle w:val="NormalWeb"/>
-      </w:pPr>
-      <w:r>
-        <w:t>Avoid:</w:t>
-      </w:r>
-    </w:p>
-    <w:p>
-      <w:pPr>
-        <w:shd w:val="clear" w:color="auto" w:fill="1E1E1E"/>
-        <w:spacing w:after="0" w:line="285" w:lineRule="atLeast"/>
-        <w:rPr>
-          <w:rFonts w:ascii="Consolas" w:eastAsia="Times New Roman" w:hAnsi="Consolas" w:cs="Times New Roman"/>
-          <w:color w:val="D4D4D4"/>
-          <w:sz w:val="21"/>
-          <w:szCs w:val="21"/>
-        </w:rPr>
-      </w:pPr>
-      <w:r>
-        <w:rPr>
-          <w:rFonts w:ascii="Consolas" w:eastAsia="Times New Roman" w:hAnsi="Consolas" w:cs="Times New Roman"/>
-          <w:color w:val="9CDCFE"/>
-          <w:sz w:val="21"/>
-          <w:szCs w:val="21"/>
-        </w:rPr>
-        <w:t>routers</w:t>
-      </w:r>
-      <w:r>
-        <w:rPr>
-          <w:rFonts w:ascii="Consolas" w:eastAsia="Times New Roman" w:hAnsi="Consolas" w:cs="Times New Roman"/>
-          <w:color w:val="D4D4D4"/>
-          <w:sz w:val="21"/>
-          <w:szCs w:val="21"/>
-        </w:rPr>
-        <w:t xml:space="preserve"> = APIRouter()</w:t>
-      </w:r>
-    </w:p>
-    <w:p>
-      <w:pPr>
-        <w:pStyle w:val="HTMLPreformatted"/>
-      </w:pPr>
-    </w:p>
-    <w:p>
-      <w:r>
-        <w:pict>
-          <v:rect id="_x0000_i1034" style="width:0;height:1.5pt" o:hralign="center" o:hrstd="t" o:hr="t" fillcolor="#a0a0a0" stroked="f"/>
         </w:pict>
       </w:r>
     </w:p>
@@ -4279,15 +4279,7 @@
           <w:color w:val="000000" w:themeColor="text1"/>
           <w:highlight w:val="yellow"/>
         </w:rPr>
-        <w:t>Chapter 79</w:t>
-      </w:r>
-      <w:r>
-        <w:rPr>
-          <w:b/>
-          <w:color w:val="000000" w:themeColor="text1"/>
-          <w:highlight w:val="yellow"/>
-        </w:rPr>
-        <w:t xml:space="preserve"> — Tags (API Documentation Organization)</w:t>
+        <w:t>Chapter 79 — Tags (API Documentation Organization)</w:t>
       </w:r>
     </w:p>
     <w:p>
@@ -4434,7 +4426,7 @@
       </w:pPr>
       <w:r>
         <w:pict>
-          <v:rect id="_x0000_i1050" style="width:0;height:1.5pt" o:hralign="center" o:hrstd="t" o:hr="t" fillcolor="#a0a0a0" stroked="f"/>
+          <v:rect id="_x0000_i1033" style="width:0;height:1.5pt" o:hralign="center" o:hrstd="t" o:hr="t" fillcolor="#a0a0a0" stroked="f"/>
         </w:pict>
       </w:r>
     </w:p>
@@ -4904,7 +4896,7 @@
       </w:pPr>
       <w:r>
         <w:pict>
-          <v:rect id="_x0000_i1051" style="width:0;height:1.5pt" o:hralign="center" o:hrstd="t" o:hr="t" fillcolor="#a0a0a0" stroked="f"/>
+          <v:rect id="_x0000_i1034" style="width:0;height:1.5pt" o:hralign="center" o:hrstd="t" o:hr="t" fillcolor="#a0a0a0" stroked="f"/>
         </w:pict>
       </w:r>
     </w:p>
@@ -5640,7 +5632,7 @@
       </w:pPr>
       <w:r>
         <w:pict>
-          <v:rect id="_x0000_i1052" style="width:0;height:1.5pt" o:hralign="center" o:hrstd="t" o:hr="t" fillcolor="#a0a0a0" stroked="f"/>
+          <v:rect id="_x0000_i1035" style="width:0;height:1.5pt" o:hralign="center" o:hrstd="t" o:hr="t" fillcolor="#a0a0a0" stroked="f"/>
         </w:pict>
       </w:r>
     </w:p>
@@ -6345,7 +6337,7 @@
       </w:pPr>
       <w:r>
         <w:pict>
-          <v:rect id="_x0000_i1053" style="width:0;height:1.5pt" o:hralign="center" o:hrstd="t" o:hr="t" fillcolor="#a0a0a0" stroked="f"/>
+          <v:rect id="_x0000_i1036" style="width:0;height:1.5pt" o:hralign="center" o:hrstd="t" o:hr="t" fillcolor="#a0a0a0" stroked="f"/>
         </w:pict>
       </w:r>
     </w:p>
@@ -6643,17 +6635,7 @@
           <w:highlight w:val="yellow"/>
         </w:rPr>
         <w:lastRenderedPageBreak/>
-        <w:t>Chapter 80</w:t>
-      </w:r>
-      <w:r>
-        <w:rPr>
-          <w:b/>
-          <w:color w:val="000000" w:themeColor="text1"/>
-          <w:sz w:val="40"/>
-          <w:szCs w:val="40"/>
-          <w:highlight w:val="yellow"/>
-        </w:rPr>
-        <w:t xml:space="preserve"> — Prefix (Route Path Organization)</w:t>
+        <w:t>Chapter 80 — Prefix (Route Path Organization)</w:t>
       </w:r>
     </w:p>
     <w:p>
@@ -6775,7 +6757,7 @@
       </w:pPr>
       <w:r>
         <w:pict>
-          <v:rect id="_x0000_i1058" style="width:0;height:1.5pt" o:hralign="center" o:hrstd="t" o:hr="t" fillcolor="#a0a0a0" stroked="f"/>
+          <v:rect id="_x0000_i1037" style="width:0;height:1.5pt" o:hralign="center" o:hrstd="t" o:hr="t" fillcolor="#a0a0a0" stroked="f"/>
         </w:pict>
       </w:r>
     </w:p>
@@ -6973,7 +6955,7 @@
       </w:pPr>
       <w:r>
         <w:pict>
-          <v:rect id="_x0000_i1059" style="width:0;height:1.5pt" o:hralign="center" o:hrstd="t" o:hr="t" fillcolor="#a0a0a0" stroked="f"/>
+          <v:rect id="_x0000_i1038" style="width:0;height:1.5pt" o:hralign="center" o:hrstd="t" o:hr="t" fillcolor="#a0a0a0" stroked="f"/>
         </w:pict>
       </w:r>
     </w:p>
@@ -7749,7 +7731,7 @@
       </w:pPr>
       <w:r>
         <w:pict>
-          <v:rect id="_x0000_i1060" style="width:0;height:1.5pt" o:hralign="center" o:hrstd="t" o:hr="t" fillcolor="#a0a0a0" stroked="f"/>
+          <v:rect id="_x0000_i1039" style="width:0;height:1.5pt" o:hralign="center" o:hrstd="t" o:hr="t" fillcolor="#a0a0a0" stroked="f"/>
         </w:pict>
       </w:r>
     </w:p>
@@ -8581,7 +8563,7 @@
       </w:pPr>
       <w:r>
         <w:pict>
-          <v:rect id="_x0000_i1061" style="width:0;height:1.5pt" o:hralign="center" o:hrstd="t" o:hr="t" fillcolor="#a0a0a0" stroked="f"/>
+          <v:rect id="_x0000_i1040" style="width:0;height:1.5pt" o:hralign="center" o:hrstd="t" o:hr="t" fillcolor="#a0a0a0" stroked="f"/>
         </w:pict>
       </w:r>
     </w:p>
@@ -8862,7 +8844,7 @@
     <w:p>
       <w:r>
         <w:pict>
-          <v:rect id="_x0000_i1062" style="width:0;height:1.5pt" o:hralign="center" o:hrstd="t" o:hr="t" fillcolor="#a0a0a0" stroked="f"/>
+          <v:rect id="_x0000_i1041" style="width:0;height:1.5pt" o:hralign="center" o:hrstd="t" o:hr="t" fillcolor="#a0a0a0" stroked="f"/>
         </w:pict>
       </w:r>
     </w:p>
@@ -9384,7 +9366,7 @@
     <w:p>
       <w:r>
         <w:pict>
-          <v:rect id="_x0000_i1063" style="width:0;height:1.5pt" o:hralign="center" o:hrstd="t" o:hr="t" fillcolor="#a0a0a0" stroked="f"/>
+          <v:rect id="_x0000_i1042" style="width:0;height:1.5pt" o:hralign="center" o:hrstd="t" o:hr="t" fillcolor="#a0a0a0" stroked="f"/>
         </w:pict>
       </w:r>
     </w:p>
@@ -9581,7 +9563,7 @@
     <w:p>
       <w:r>
         <w:pict>
-          <v:rect id="_x0000_i1064" style="width:0;height:1.5pt" o:hralign="center" o:hrstd="t" o:hr="t" fillcolor="#a0a0a0" stroked="f"/>
+          <v:rect id="_x0000_i1043" style="width:0;height:1.5pt" o:hralign="center" o:hrstd="t" o:hr="t" fillcolor="#a0a0a0" stroked="f"/>
         </w:pict>
       </w:r>
     </w:p>
@@ -9800,7 +9782,7 @@
     <w:p>
       <w:r>
         <w:pict>
-          <v:rect id="_x0000_i1065" style="width:0;height:1.5pt" o:hralign="center" o:hrstd="t" o:hr="t" fillcolor="#a0a0a0" stroked="f"/>
+          <v:rect id="_x0000_i1044" style="width:0;height:1.5pt" o:hralign="center" o:hrstd="t" o:hr="t" fillcolor="#a0a0a0" stroked="f"/>
         </w:pict>
       </w:r>
     </w:p>
@@ -10025,6 +10007,147 @@
       </w:r>
       <w:r>
         <w:t xml:space="preserve"> are structured.</w:t>
+      </w:r>
+    </w:p>
+    <w:p>
+      <w:pPr>
+        <w:pStyle w:val="NormalWeb"/>
+      </w:pPr>
+    </w:p>
+    <w:p>
+      <w:pPr>
+        <w:pStyle w:val="NormalWeb"/>
+        <w:pBdr>
+          <w:bottom w:val="single" w:sz="6" w:space="1" w:color="auto"/>
+        </w:pBdr>
+      </w:pPr>
+    </w:p>
+    <w:p>
+      <w:pPr>
+        <w:pStyle w:val="NormalWeb"/>
+      </w:pPr>
+      <w:r>
+        <w:lastRenderedPageBreak/>
+        <w:drawing>
+          <wp:inline distT="0" distB="0" distL="0" distR="0" wp14:anchorId="03BB932C" wp14:editId="41C50AC3">
+            <wp:extent cx="5943600" cy="5556250"/>
+            <wp:effectExtent l="0" t="0" r="0" b="6350"/>
+            <wp:docPr id="1" name="Picture 1"/>
+            <wp:cNvGraphicFramePr>
+              <a:graphicFrameLocks xmlns:a="http://schemas.openxmlformats.org/drawingml/2006/main" noChangeAspect="1"/>
+            </wp:cNvGraphicFramePr>
+            <a:graphic xmlns:a="http://schemas.openxmlformats.org/drawingml/2006/main">
+              <a:graphicData uri="http://schemas.openxmlformats.org/drawingml/2006/picture">
+                <pic:pic xmlns:pic="http://schemas.openxmlformats.org/drawingml/2006/picture">
+                  <pic:nvPicPr>
+                    <pic:cNvPr id="1" name=""/>
+                    <pic:cNvPicPr/>
+                  </pic:nvPicPr>
+                  <pic:blipFill>
+                    <a:blip r:embed="rId5"/>
+                    <a:stretch>
+                      <a:fillRect/>
+                    </a:stretch>
+                  </pic:blipFill>
+                  <pic:spPr>
+                    <a:xfrm>
+                      <a:off x="0" y="0"/>
+                      <a:ext cx="5943600" cy="5556250"/>
+                    </a:xfrm>
+                    <a:prstGeom prst="rect">
+                      <a:avLst/>
+                    </a:prstGeom>
+                  </pic:spPr>
+                </pic:pic>
+              </a:graphicData>
+            </a:graphic>
+          </wp:inline>
+        </w:drawing>
+      </w:r>
+    </w:p>
+    <w:p>
+      <w:pPr>
+        <w:pStyle w:val="NormalWeb"/>
+      </w:pPr>
+      <w:r>
+        <w:drawing>
+          <wp:inline distT="0" distB="0" distL="0" distR="0" wp14:anchorId="24800CF0" wp14:editId="20BAD4CF">
+            <wp:extent cx="5943600" cy="1220470"/>
+            <wp:effectExtent l="0" t="0" r="0" b="0"/>
+            <wp:docPr id="2" name="Picture 2"/>
+            <wp:cNvGraphicFramePr>
+              <a:graphicFrameLocks xmlns:a="http://schemas.openxmlformats.org/drawingml/2006/main" noChangeAspect="1"/>
+            </wp:cNvGraphicFramePr>
+            <a:graphic xmlns:a="http://schemas.openxmlformats.org/drawingml/2006/main">
+              <a:graphicData uri="http://schemas.openxmlformats.org/drawingml/2006/picture">
+                <pic:pic xmlns:pic="http://schemas.openxmlformats.org/drawingml/2006/picture">
+                  <pic:nvPicPr>
+                    <pic:cNvPr id="1" name=""/>
+                    <pic:cNvPicPr/>
+                  </pic:nvPicPr>
+                  <pic:blipFill>
+                    <a:blip r:embed="rId6"/>
+                    <a:stretch>
+                      <a:fillRect/>
+                    </a:stretch>
+                  </pic:blipFill>
+                  <pic:spPr>
+                    <a:xfrm>
+                      <a:off x="0" y="0"/>
+                      <a:ext cx="5943600" cy="1220470"/>
+                    </a:xfrm>
+                    <a:prstGeom prst="rect">
+                      <a:avLst/>
+                    </a:prstGeom>
+                  </pic:spPr>
+                </pic:pic>
+              </a:graphicData>
+            </a:graphic>
+          </wp:inline>
+        </w:drawing>
+      </w:r>
+    </w:p>
+    <w:p>
+      <w:pPr>
+        <w:pStyle w:val="NormalWeb"/>
+      </w:pPr>
+      <w:r>
+        <w:lastRenderedPageBreak/>
+        <w:drawing>
+          <wp:inline distT="0" distB="0" distL="0" distR="0" wp14:anchorId="298FD2AF" wp14:editId="0DF2D102">
+            <wp:extent cx="5943600" cy="2215515"/>
+            <wp:effectExtent l="0" t="0" r="0" b="0"/>
+            <wp:docPr id="3" name="Picture 3"/>
+            <wp:cNvGraphicFramePr>
+              <a:graphicFrameLocks xmlns:a="http://schemas.openxmlformats.org/drawingml/2006/main" noChangeAspect="1"/>
+            </wp:cNvGraphicFramePr>
+            <a:graphic xmlns:a="http://schemas.openxmlformats.org/drawingml/2006/main">
+              <a:graphicData uri="http://schemas.openxmlformats.org/drawingml/2006/picture">
+                <pic:pic xmlns:pic="http://schemas.openxmlformats.org/drawingml/2006/picture">
+                  <pic:nvPicPr>
+                    <pic:cNvPr id="1" name=""/>
+                    <pic:cNvPicPr/>
+                  </pic:nvPicPr>
+                  <pic:blipFill>
+                    <a:blip r:embed="rId7"/>
+                    <a:stretch>
+                      <a:fillRect/>
+                    </a:stretch>
+                  </pic:blipFill>
+                  <pic:spPr>
+                    <a:xfrm>
+                      <a:off x="0" y="0"/>
+                      <a:ext cx="5943600" cy="2215515"/>
+                    </a:xfrm>
+                    <a:prstGeom prst="rect">
+                      <a:avLst/>
+                    </a:prstGeom>
+                  </pic:spPr>
+                </pic:pic>
+              </a:graphicData>
+            </a:graphic>
+          </wp:inline>
+        </w:drawing>
       </w:r>
     </w:p>
     <w:p>

</xml_diff>